<commit_message>
feat: v4.0 — convert WSQ TGS-2026064534 courseware to non-WSQ C1143
Replaces the v3.0 set with a conversion of the WSQ "Build Full Stack React Web
App with Vibe Coding" v4.0 courseware: WSQ/assessment/attendance slides removed,
Course Feedback slide added in place of Assessment Flow, LP retimed to
9:30am-5:30pm (450 min/day, single 30-min lunch), 25 labs, neon/schema.sql.

Co-Authored-By: Claude Opus 5.5 <noreply@anthropic.com>
</commit_message>
<xml_diff>
--- a/courseware/LG-AI Vibe Coding for React Development.docx
+++ b/courseware/LG-AI Vibe Coding for React Development.docx
@@ -179,7 +179,7 @@
           <w:color w:val="1F6FEB"/>
           <w:sz w:val="24"/>
         </w:rPr>
-        <w:t>Version 3.0</w:t>
+        <w:t>Version 4.0</w:t>
       </w:r>
     </w:p>
     <w:p>
@@ -294,7 +294,7 @@
               <w:rPr>
                 <w:sz w:val="19"/>
               </w:rPr>
-              <w:t>2.0</w:t>
+              <w:t>1.0</w:t>
             </w:r>
           </w:p>
         </w:tc>
@@ -308,7 +308,7 @@
               <w:rPr>
                 <w:sz w:val="19"/>
               </w:rPr>
-              <w:t>12 July 2026</w:t>
+              <w:t>10 July 2026</w:t>
             </w:r>
           </w:p>
         </w:tc>
@@ -322,7 +322,7 @@
               <w:rPr>
                 <w:sz w:val="19"/>
               </w:rPr>
-              <w:t>C1143 20-lab agentic-loop edition.</w:t>
+              <w:t>Initial release — Learner Guide covering all 24 hands-on labs across six topics, with key-concept explanations, the AI React Bug Checklist, troubleshooting and a glossary.</w:t>
             </w:r>
           </w:p>
         </w:tc>
@@ -352,7 +352,7 @@
               <w:rPr>
                 <w:sz w:val="19"/>
               </w:rPr>
-              <w:t>2.1</w:t>
+              <w:t>2.0</w:t>
             </w:r>
           </w:p>
         </w:tc>
@@ -366,7 +366,7 @@
               <w:rPr>
                 <w:sz w:val="19"/>
               </w:rPr>
-              <w:t>21 July 2026</w:t>
+              <w:t>11 July 2026</w:t>
             </w:r>
           </w:p>
         </w:tc>
@@ -380,7 +380,7 @@
               <w:rPr>
                 <w:sz w:val="19"/>
               </w:rPr>
-              <w:t>Title, contents and schedule corrections.</w:t>
+              <w:t>Added a JavaScript prerequisites chapter and per-topic Concept deep-dive sections with worked code and analogies.</w:t>
             </w:r>
           </w:p>
         </w:tc>
@@ -424,7 +424,7 @@
               <w:rPr>
                 <w:sz w:val="19"/>
               </w:rPr>
-              <w:t>21 July 2026</w:t>
+              <w:t>11 July 2026</w:t>
             </w:r>
           </w:p>
         </w:tc>
@@ -438,7 +438,65 @@
               <w:rPr>
                 <w:sz w:val="19"/>
               </w:rPr>
-              <w:t>Rebuilt on the flagship 2-day Full Stack React with Vibe Coding courseware: 25 hands-on labs across six topics building the Cook &amp; Bake Academy app end to end, with key-concept explanations, deep dives, the AI React Bug Checklist, troubleshooting and a glossary. Non-assessed delivery.</w:t>
+              <w:t>Restructured the whole course around ONE progressively-built full-stack project on Neon + Vercel: removed the standalone side projects, expanded the props / refs / hooks / components / state explanations, and added the mini-capstone (add a course-reviews feature, mostly on your own).</w:t>
+            </w:r>
+          </w:p>
+        </w:tc>
+        <w:tc>
+          <w:tcPr>
+            <w:tcW w:type="dxa" w:w="2160"/>
+          </w:tcPr>
+          <w:p>
+            <w:r/>
+            <w:r>
+              <w:rPr>
+                <w:sz w:val="19"/>
+              </w:rPr>
+              <w:t>Dr. Alfred Ang</w:t>
+            </w:r>
+          </w:p>
+        </w:tc>
+      </w:tr>
+      <w:tr>
+        <w:tc>
+          <w:tcPr>
+            <w:tcW w:type="dxa" w:w="2160"/>
+          </w:tcPr>
+          <w:p>
+            <w:r/>
+            <w:r>
+              <w:rPr>
+                <w:sz w:val="19"/>
+              </w:rPr>
+              <w:t>4.0</w:t>
+            </w:r>
+          </w:p>
+        </w:tc>
+        <w:tc>
+          <w:tcPr>
+            <w:tcW w:type="dxa" w:w="2160"/>
+          </w:tcPr>
+          <w:p>
+            <w:r/>
+            <w:r>
+              <w:rPr>
+                <w:sz w:val="19"/>
+              </w:rPr>
+              <w:t>11 July 2026</w:t>
+            </w:r>
+          </w:p>
+        </w:tc>
+        <w:tc>
+          <w:tcPr>
+            <w:tcW w:type="dxa" w:w="2160"/>
+          </w:tcPr>
+          <w:p>
+            <w:r/>
+            <w:r>
+              <w:rPr>
+                <w:sz w:val="19"/>
+              </w:rPr>
+              <w:t>Replaced the running project with Cook &amp; Bake Academy (a cooking &amp; bakery school website, deployed live at cookbake-academy.vercel.app). Re-architected Topic 5 from the browser-side Neon Data API + Row Level Security to a three-tier serverless API (/api routes over Neon, parameterised SQL, bcrypt + JWT). Added a foundations chapter on the real DOM vs the Virtual DOM and Babel/JSX compilation, and deepened useRef; removed the JavaScript-refresher chapter (modern JavaScript is now assumed).</w:t>
             </w:r>
           </w:p>
         </w:tc>
@@ -477,1609 +535,12 @@
       </w:r>
     </w:p>
     <w:p>
-      <w:pPr>
-        <w:tabs>
-          <w:tab w:pos="9072" w:val="right" w:leader="dot"/>
-        </w:tabs>
-        <w:spacing w:after="60"/>
-      </w:pPr>
-      <w:r>
-        <w:rPr>
-          <w:rFonts w:ascii="Arial" w:hAnsi="Arial"/>
-          <w:b/>
-          <w:color w:val="333333"/>
-          <w:sz w:val="22"/>
-        </w:rPr>
-        <w:t>Introduction</w:t>
-        <w:tab/>
-        <w:t>6</w:t>
-      </w:r>
-    </w:p>
-    <w:p>
-      <w:pPr>
-        <w:tabs>
-          <w:tab w:pos="9072" w:val="right" w:leader="dot"/>
-        </w:tabs>
-        <w:spacing w:after="60"/>
-      </w:pPr>
-      <w:r>
-        <w:rPr>
-          <w:rFonts w:ascii="Arial" w:hAnsi="Arial"/>
-          <w:b/>
-          <w:color w:val="333333"/>
-          <w:sz w:val="22"/>
-        </w:rPr>
-        <w:t>The Vibe Coding Loop</w:t>
-        <w:tab/>
-        <w:t>6</w:t>
-      </w:r>
-    </w:p>
-    <w:p>
-      <w:pPr>
-        <w:tabs>
-          <w:tab w:pos="9072" w:val="right" w:leader="dot"/>
-        </w:tabs>
-        <w:spacing w:after="60"/>
-      </w:pPr>
-      <w:r>
-        <w:rPr>
-          <w:rFonts w:ascii="Arial" w:hAnsi="Arial"/>
-          <w:b/>
-          <w:color w:val="333333"/>
-          <w:sz w:val="22"/>
-        </w:rPr>
-        <w:t>Course Learning Outcomes</w:t>
-        <w:tab/>
-        <w:t>6</w:t>
-      </w:r>
-    </w:p>
-    <w:p>
-      <w:pPr>
-        <w:tabs>
-          <w:tab w:pos="9072" w:val="right" w:leader="dot"/>
-        </w:tabs>
-        <w:spacing w:after="60"/>
-      </w:pPr>
-      <w:r>
-        <w:rPr>
-          <w:rFonts w:ascii="Arial" w:hAnsi="Arial"/>
-          <w:b/>
-          <w:color w:val="333333"/>
-          <w:sz w:val="22"/>
-        </w:rPr>
-        <w:t>Before You Start — Environment Setup</w:t>
-        <w:tab/>
-        <w:t>7</w:t>
-      </w:r>
-    </w:p>
-    <w:p>
-      <w:pPr>
-        <w:tabs>
-          <w:tab w:pos="9072" w:val="right" w:leader="dot"/>
-        </w:tabs>
-        <w:spacing w:after="60"/>
-      </w:pPr>
-      <w:r>
-        <w:rPr>
-          <w:rFonts w:ascii="Arial" w:hAnsi="Arial"/>
-          <w:b/>
-          <w:color w:val="333333"/>
-          <w:sz w:val="22"/>
-        </w:rPr>
-        <w:t>How React Really Renders: the DOM, the Virtual DOM and Babel</w:t>
-        <w:tab/>
-        <w:t>8</w:t>
-      </w:r>
-    </w:p>
-    <w:p>
-      <w:pPr>
-        <w:tabs>
-          <w:tab w:pos="9072" w:val="right" w:leader="dot"/>
-        </w:tabs>
-        <w:spacing w:after="60"/>
-        <w:ind w:left="432"/>
-      </w:pPr>
-      <w:r>
-        <w:rPr>
-          <w:rFonts w:ascii="Arial" w:hAnsi="Arial"/>
-          <w:b w:val="0"/>
-          <w:color w:val="333333"/>
-          <w:sz w:val="21"/>
-        </w:rPr>
-        <w:t>The DOM is the browser's object tree</w:t>
-        <w:tab/>
-        <w:t>8</w:t>
-      </w:r>
-    </w:p>
-    <w:p>
-      <w:pPr>
-        <w:tabs>
-          <w:tab w:pos="9072" w:val="right" w:leader="dot"/>
-        </w:tabs>
-        <w:spacing w:after="60"/>
-        <w:ind w:left="432"/>
-      </w:pPr>
-      <w:r>
-        <w:rPr>
-          <w:rFonts w:ascii="Arial" w:hAnsi="Arial"/>
-          <w:b w:val="0"/>
-          <w:color w:val="333333"/>
-          <w:sz w:val="21"/>
-        </w:rPr>
-        <w:t>Updating the page without React</w:t>
-        <w:tab/>
-        <w:t>9</w:t>
-      </w:r>
-    </w:p>
-    <w:p>
-      <w:pPr>
-        <w:tabs>
-          <w:tab w:pos="9072" w:val="right" w:leader="dot"/>
-        </w:tabs>
-        <w:spacing w:after="60"/>
-        <w:ind w:left="432"/>
-      </w:pPr>
-      <w:r>
-        <w:rPr>
-          <w:rFonts w:ascii="Arial" w:hAnsi="Arial"/>
-          <w:b w:val="0"/>
-          <w:color w:val="333333"/>
-          <w:sz w:val="21"/>
-        </w:rPr>
-        <w:t>The Virtual DOM is React's plan</w:t>
-        <w:tab/>
-        <w:t>10</w:t>
-      </w:r>
-    </w:p>
-    <w:p>
-      <w:pPr>
-        <w:tabs>
-          <w:tab w:pos="9072" w:val="right" w:leader="dot"/>
-        </w:tabs>
-        <w:spacing w:after="60"/>
-        <w:ind w:left="432"/>
-      </w:pPr>
-      <w:r>
-        <w:rPr>
-          <w:rFonts w:ascii="Arial" w:hAnsi="Arial"/>
-          <w:b w:val="0"/>
-          <w:color w:val="333333"/>
-          <w:sz w:val="21"/>
-        </w:rPr>
-        <w:t>Real DOM vs Virtual DOM, side by side</w:t>
-        <w:tab/>
-        <w:t>10</w:t>
-      </w:r>
-    </w:p>
-    <w:p>
-      <w:pPr>
-        <w:tabs>
-          <w:tab w:pos="9072" w:val="right" w:leader="dot"/>
-        </w:tabs>
-        <w:spacing w:after="60"/>
-        <w:ind w:left="432"/>
-      </w:pPr>
-      <w:r>
-        <w:rPr>
-          <w:rFonts w:ascii="Arial" w:hAnsi="Arial"/>
-          <w:b w:val="0"/>
-          <w:color w:val="333333"/>
-          <w:sz w:val="21"/>
-        </w:rPr>
-        <w:t>Babel: the browser never sees JSX</w:t>
-        <w:tab/>
-        <w:t>11</w:t>
-      </w:r>
-    </w:p>
-    <w:p>
-      <w:pPr>
-        <w:tabs>
-          <w:tab w:pos="9072" w:val="right" w:leader="dot"/>
-        </w:tabs>
-        <w:spacing w:after="60"/>
-        <w:ind w:left="432"/>
-      </w:pPr>
-      <w:r>
-        <w:rPr>
-          <w:rFonts w:ascii="Arial" w:hAnsi="Arial"/>
-          <w:b w:val="0"/>
-          <w:color w:val="333333"/>
-          <w:sz w:val="21"/>
-        </w:rPr>
-        <w:t>Why that one fact explains everything</w:t>
-        <w:tab/>
-        <w:t>12</w:t>
-      </w:r>
-    </w:p>
-    <w:p>
-      <w:pPr>
-        <w:tabs>
-          <w:tab w:pos="9072" w:val="right" w:leader="dot"/>
-        </w:tabs>
-        <w:spacing w:after="60"/>
-      </w:pPr>
-      <w:r>
-        <w:rPr>
-          <w:rFonts w:ascii="Arial" w:hAnsi="Arial"/>
-          <w:b/>
-          <w:color w:val="333333"/>
-          <w:sz w:val="22"/>
-        </w:rPr>
-        <w:t>Topic 01 — Build a React Web App Using Vibe Coding</w:t>
-        <w:tab/>
-        <w:t>13</w:t>
-      </w:r>
-    </w:p>
-    <w:p>
-      <w:pPr>
-        <w:tabs>
-          <w:tab w:pos="9072" w:val="right" w:leader="dot"/>
-        </w:tabs>
-        <w:spacing w:after="60"/>
-        <w:ind w:left="432"/>
-      </w:pPr>
-      <w:r>
-        <w:rPr>
-          <w:rFonts w:ascii="Arial" w:hAnsi="Arial"/>
-          <w:b w:val="0"/>
-          <w:color w:val="333333"/>
-          <w:sz w:val="21"/>
-        </w:rPr>
-        <w:t>Key Concepts — Topic 01</w:t>
-        <w:tab/>
-        <w:t>13</w:t>
-      </w:r>
-    </w:p>
-    <w:p>
-      <w:pPr>
-        <w:tabs>
-          <w:tab w:pos="9072" w:val="right" w:leader="dot"/>
-        </w:tabs>
-        <w:spacing w:after="60"/>
-        <w:ind w:left="432"/>
-      </w:pPr>
-      <w:r>
-        <w:rPr>
-          <w:rFonts w:ascii="Arial" w:hAnsi="Arial"/>
-          <w:b w:val="0"/>
-          <w:color w:val="333333"/>
-          <w:sz w:val="21"/>
-        </w:rPr>
-        <w:t>Concepts Explained — Topic 01</w:t>
-        <w:tab/>
-        <w:t>13</w:t>
-      </w:r>
-    </w:p>
-    <w:p>
-      <w:pPr>
-        <w:tabs>
-          <w:tab w:pos="9072" w:val="right" w:leader="dot"/>
-        </w:tabs>
-        <w:spacing w:after="60"/>
-        <w:ind w:left="432"/>
-      </w:pPr>
-      <w:r>
-        <w:rPr>
-          <w:rFonts w:ascii="Arial" w:hAnsi="Arial"/>
-          <w:b w:val="0"/>
-          <w:color w:val="333333"/>
-          <w:sz w:val="21"/>
-        </w:rPr>
-        <w:t>Deep Dive — What vibe coding actually is</w:t>
-        <w:tab/>
-        <w:t>20</w:t>
-      </w:r>
-    </w:p>
-    <w:p>
-      <w:pPr>
-        <w:tabs>
-          <w:tab w:pos="9072" w:val="right" w:leader="dot"/>
-        </w:tabs>
-        <w:spacing w:after="60"/>
-        <w:ind w:left="432"/>
-      </w:pPr>
-      <w:r>
-        <w:rPr>
-          <w:rFonts w:ascii="Arial" w:hAnsi="Arial"/>
-          <w:b w:val="0"/>
-          <w:color w:val="333333"/>
-          <w:sz w:val="21"/>
-        </w:rPr>
-        <w:t>Deep Dive — Why JSX is not HTML — and what Babel does to it</w:t>
-        <w:tab/>
-        <w:t>20</w:t>
-      </w:r>
-    </w:p>
-    <w:p>
-      <w:pPr>
-        <w:tabs>
-          <w:tab w:pos="9072" w:val="right" w:leader="dot"/>
-        </w:tabs>
-        <w:spacing w:after="60"/>
-        <w:ind w:left="432"/>
-      </w:pPr>
-      <w:r>
-        <w:rPr>
-          <w:rFonts w:ascii="Arial" w:hAnsi="Arial"/>
-          <w:b w:val="0"/>
-          <w:color w:val="333333"/>
-          <w:sz w:val="21"/>
-        </w:rPr>
-        <w:t>Deep Dive — Components and props: functions and their arguments</w:t>
-        <w:tab/>
-        <w:t>22</w:t>
-      </w:r>
-    </w:p>
-    <w:p>
-      <w:pPr>
-        <w:tabs>
-          <w:tab w:pos="9072" w:val="right" w:leader="dot"/>
-        </w:tabs>
-        <w:spacing w:after="60"/>
-        <w:ind w:left="432"/>
-      </w:pPr>
-      <w:r>
-        <w:rPr>
-          <w:rFonts w:ascii="Arial" w:hAnsi="Arial"/>
-          <w:b w:val="0"/>
-          <w:color w:val="333333"/>
-          <w:sz w:val="21"/>
-        </w:rPr>
-        <w:t>Deep Dive — A component is a pure function</w:t>
-        <w:tab/>
-        <w:t>23</w:t>
-      </w:r>
-    </w:p>
-    <w:p>
-      <w:pPr>
-        <w:tabs>
-          <w:tab w:pos="9072" w:val="right" w:leader="dot"/>
-        </w:tabs>
-        <w:spacing w:after="60"/>
-        <w:ind w:left="432"/>
-      </w:pPr>
-      <w:r>
-        <w:rPr>
-          <w:rFonts w:ascii="Arial" w:hAnsi="Arial"/>
-          <w:b w:val="0"/>
-          <w:color w:val="333333"/>
-          <w:sz w:val="21"/>
-        </w:rPr>
-        <w:t>Lab 1.1 — Set Up Your Vibe Coding Workspace</w:t>
-        <w:tab/>
-        <w:t>24</w:t>
-      </w:r>
-    </w:p>
-    <w:p>
-      <w:pPr>
-        <w:tabs>
-          <w:tab w:pos="9072" w:val="right" w:leader="dot"/>
-        </w:tabs>
-        <w:spacing w:after="60"/>
-        <w:ind w:left="432"/>
-      </w:pPr>
-      <w:r>
-        <w:rPr>
-          <w:rFonts w:ascii="Arial" w:hAnsi="Arial"/>
-          <w:b w:val="0"/>
-          <w:color w:val="333333"/>
-          <w:sz w:val="21"/>
-        </w:rPr>
-        <w:t>Lab 1.2 — Your First Vibe-Coded Component: CourseCard</w:t>
-        <w:tab/>
-        <w:t>25</w:t>
-      </w:r>
-    </w:p>
-    <w:p>
-      <w:pPr>
-        <w:tabs>
-          <w:tab w:pos="9072" w:val="right" w:leader="dot"/>
-        </w:tabs>
-        <w:spacing w:after="60"/>
-        <w:ind w:left="432"/>
-      </w:pPr>
-      <w:r>
-        <w:rPr>
-          <w:rFonts w:ascii="Arial" w:hAnsi="Arial"/>
-          <w:b w:val="0"/>
-          <w:color w:val="333333"/>
-          <w:sz w:val="21"/>
-        </w:rPr>
-        <w:t>Lab 1.3 — Vibe-Code the Cook &amp; Bake Academy Landing Page</w:t>
-        <w:tab/>
-        <w:t>27</w:t>
-      </w:r>
-    </w:p>
-    <w:p>
-      <w:pPr>
-        <w:tabs>
-          <w:tab w:pos="9072" w:val="right" w:leader="dot"/>
-        </w:tabs>
-        <w:spacing w:after="60"/>
-      </w:pPr>
-      <w:r>
-        <w:rPr>
-          <w:rFonts w:ascii="Arial" w:hAnsi="Arial"/>
-          <w:b/>
-          <w:color w:val="333333"/>
-          <w:sz w:val="22"/>
-        </w:rPr>
-        <w:t>Topic 02 — Deploy Your React Web App to the Cloud</w:t>
-        <w:tab/>
-        <w:t>28</w:t>
-      </w:r>
-    </w:p>
-    <w:p>
-      <w:pPr>
-        <w:tabs>
-          <w:tab w:pos="9072" w:val="right" w:leader="dot"/>
-        </w:tabs>
-        <w:spacing w:after="60"/>
-        <w:ind w:left="432"/>
-      </w:pPr>
-      <w:r>
-        <w:rPr>
-          <w:rFonts w:ascii="Arial" w:hAnsi="Arial"/>
-          <w:b w:val="0"/>
-          <w:color w:val="333333"/>
-          <w:sz w:val="21"/>
-        </w:rPr>
-        <w:t>Key Concepts — Topic 02</w:t>
-        <w:tab/>
-        <w:t>28</w:t>
-      </w:r>
-    </w:p>
-    <w:p>
-      <w:pPr>
-        <w:tabs>
-          <w:tab w:pos="9072" w:val="right" w:leader="dot"/>
-        </w:tabs>
-        <w:spacing w:after="60"/>
-        <w:ind w:left="432"/>
-      </w:pPr>
-      <w:r>
-        <w:rPr>
-          <w:rFonts w:ascii="Arial" w:hAnsi="Arial"/>
-          <w:b w:val="0"/>
-          <w:color w:val="333333"/>
-          <w:sz w:val="21"/>
-        </w:rPr>
-        <w:t>Concepts Explained — Topic 02</w:t>
-        <w:tab/>
-        <w:t>28</w:t>
-      </w:r>
-    </w:p>
-    <w:p>
-      <w:pPr>
-        <w:tabs>
-          <w:tab w:pos="9072" w:val="right" w:leader="dot"/>
-        </w:tabs>
-        <w:spacing w:after="60"/>
-        <w:ind w:left="432"/>
-      </w:pPr>
-      <w:r>
-        <w:rPr>
-          <w:rFonts w:ascii="Arial" w:hAnsi="Arial"/>
-          <w:b w:val="0"/>
-          <w:color w:val="333333"/>
-          <w:sz w:val="21"/>
-        </w:rPr>
-        <w:t>Deep Dive — Git is the vibe coder's safety net</w:t>
-        <w:tab/>
-        <w:t>33</w:t>
-      </w:r>
-    </w:p>
-    <w:p>
-      <w:pPr>
-        <w:tabs>
-          <w:tab w:pos="9072" w:val="right" w:leader="dot"/>
-        </w:tabs>
-        <w:spacing w:after="60"/>
-        <w:ind w:left="432"/>
-      </w:pPr>
-      <w:r>
-        <w:rPr>
-          <w:rFonts w:ascii="Arial" w:hAnsi="Arial"/>
-          <w:b w:val="0"/>
-          <w:color w:val="333333"/>
-          <w:sz w:val="21"/>
-        </w:rPr>
-        <w:t>Deep Dive — From build to deployment, and the secrets rule</w:t>
-        <w:tab/>
-        <w:t>33</w:t>
-      </w:r>
-    </w:p>
-    <w:p>
-      <w:pPr>
-        <w:tabs>
-          <w:tab w:pos="9072" w:val="right" w:leader="dot"/>
-        </w:tabs>
-        <w:spacing w:after="60"/>
-        <w:ind w:left="432"/>
-      </w:pPr>
-      <w:r>
-        <w:rPr>
-          <w:rFonts w:ascii="Arial" w:hAnsi="Arial"/>
-          <w:b w:val="0"/>
-          <w:color w:val="333333"/>
-          <w:sz w:val="21"/>
-        </w:rPr>
-        <w:t>Deep Dive — Why refreshing a route can 404</w:t>
-        <w:tab/>
-        <w:t>34</w:t>
-      </w:r>
-    </w:p>
-    <w:p>
-      <w:pPr>
-        <w:tabs>
-          <w:tab w:pos="9072" w:val="right" w:leader="dot"/>
-        </w:tabs>
-        <w:spacing w:after="60"/>
-        <w:ind w:left="432"/>
-      </w:pPr>
-      <w:r>
-        <w:rPr>
-          <w:rFonts w:ascii="Arial" w:hAnsi="Arial"/>
-          <w:b w:val="0"/>
-          <w:color w:val="333333"/>
-          <w:sz w:val="21"/>
-        </w:rPr>
-        <w:t>Lab 2.1 — Version Control with Git and GitHub</w:t>
-        <w:tab/>
-        <w:t>35</w:t>
-      </w:r>
-    </w:p>
-    <w:p>
-      <w:pPr>
-        <w:tabs>
-          <w:tab w:pos="9072" w:val="right" w:leader="dot"/>
-        </w:tabs>
-        <w:spacing w:after="60"/>
-        <w:ind w:left="432"/>
-      </w:pPr>
-      <w:r>
-        <w:rPr>
-          <w:rFonts w:ascii="Arial" w:hAnsi="Arial"/>
-          <w:b w:val="0"/>
-          <w:color w:val="333333"/>
-          <w:sz w:val="21"/>
-        </w:rPr>
-        <w:t>Lab 2.2 — Deploy Cook &amp; Bake Academy to Vercel</w:t>
-        <w:tab/>
-        <w:t>36</w:t>
-      </w:r>
-    </w:p>
-    <w:p>
-      <w:pPr>
-        <w:tabs>
-          <w:tab w:pos="9072" w:val="right" w:leader="dot"/>
-        </w:tabs>
-        <w:spacing w:after="60"/>
-        <w:ind w:left="432"/>
-      </w:pPr>
-      <w:r>
-        <w:rPr>
-          <w:rFonts w:ascii="Arial" w:hAnsi="Arial"/>
-          <w:b w:val="0"/>
-          <w:color w:val="333333"/>
-          <w:sz w:val="21"/>
-        </w:rPr>
-        <w:t>Lab 2.3 — Deploy to GitHub Pages with GitHub Actions</w:t>
-        <w:tab/>
-        <w:t>38</w:t>
-      </w:r>
-    </w:p>
-    <w:p>
-      <w:pPr>
-        <w:tabs>
-          <w:tab w:pos="9072" w:val="right" w:leader="dot"/>
-        </w:tabs>
-        <w:spacing w:after="60"/>
-      </w:pPr>
-      <w:r>
-        <w:rPr>
-          <w:rFonts w:ascii="Arial" w:hAnsi="Arial"/>
-          <w:b/>
-          <w:color w:val="333333"/>
-          <w:sz w:val="22"/>
-        </w:rPr>
-        <w:t>Topic 03 — Improving Your App by Learning Core React Concepts</w:t>
-        <w:tab/>
-        <w:t>39</w:t>
-      </w:r>
-    </w:p>
-    <w:p>
-      <w:pPr>
-        <w:tabs>
-          <w:tab w:pos="9072" w:val="right" w:leader="dot"/>
-        </w:tabs>
-        <w:spacing w:after="60"/>
-        <w:ind w:left="432"/>
-      </w:pPr>
-      <w:r>
-        <w:rPr>
-          <w:rFonts w:ascii="Arial" w:hAnsi="Arial"/>
-          <w:b w:val="0"/>
-          <w:color w:val="333333"/>
-          <w:sz w:val="21"/>
-        </w:rPr>
-        <w:t>Key Concepts — Topic 03</w:t>
-        <w:tab/>
-        <w:t>39</w:t>
-      </w:r>
-    </w:p>
-    <w:p>
-      <w:pPr>
-        <w:tabs>
-          <w:tab w:pos="9072" w:val="right" w:leader="dot"/>
-        </w:tabs>
-        <w:spacing w:after="60"/>
-        <w:ind w:left="432"/>
-      </w:pPr>
-      <w:r>
-        <w:rPr>
-          <w:rFonts w:ascii="Arial" w:hAnsi="Arial"/>
-          <w:b w:val="0"/>
-          <w:color w:val="333333"/>
-          <w:sz w:val="21"/>
-        </w:rPr>
-        <w:t>Concepts Explained — Topic 03</w:t>
-        <w:tab/>
-        <w:t>40</w:t>
-      </w:r>
-    </w:p>
-    <w:p>
-      <w:pPr>
-        <w:tabs>
-          <w:tab w:pos="9072" w:val="right" w:leader="dot"/>
-        </w:tabs>
-        <w:spacing w:after="60"/>
-        <w:ind w:left="432"/>
-      </w:pPr>
-      <w:r>
-        <w:rPr>
-          <w:rFonts w:ascii="Arial" w:hAnsi="Arial"/>
-          <w:b w:val="0"/>
-          <w:color w:val="333333"/>
-          <w:sz w:val="21"/>
-        </w:rPr>
-        <w:t>Deep Dive — The real DOM, and updating a page without React</w:t>
-        <w:tab/>
-        <w:t>49</w:t>
-      </w:r>
-    </w:p>
-    <w:p>
-      <w:pPr>
-        <w:tabs>
-          <w:tab w:pos="9072" w:val="right" w:leader="dot"/>
-        </w:tabs>
-        <w:spacing w:after="60"/>
-        <w:ind w:left="432"/>
-      </w:pPr>
-      <w:r>
-        <w:rPr>
-          <w:rFonts w:ascii="Arial" w:hAnsi="Arial"/>
-          <w:b w:val="0"/>
-          <w:color w:val="333333"/>
-          <w:sz w:val="21"/>
-        </w:rPr>
-        <w:t>Deep Dive — The Virtual DOM, and declarative UI</w:t>
-        <w:tab/>
-        <w:t>50</w:t>
-      </w:r>
-    </w:p>
-    <w:p>
-      <w:pPr>
-        <w:tabs>
-          <w:tab w:pos="9072" w:val="right" w:leader="dot"/>
-        </w:tabs>
-        <w:spacing w:after="60"/>
-        <w:ind w:left="432"/>
-      </w:pPr>
-      <w:r>
-        <w:rPr>
-          <w:rFonts w:ascii="Arial" w:hAnsi="Arial"/>
-          <w:b w:val="0"/>
-          <w:color w:val="333333"/>
-          <w:sz w:val="21"/>
-        </w:rPr>
-        <w:t>Deep Dive — Keys are identity, and why key={index} bites</w:t>
-        <w:tab/>
-        <w:t>51</w:t>
-      </w:r>
-    </w:p>
-    <w:p>
-      <w:pPr>
-        <w:tabs>
-          <w:tab w:pos="9072" w:val="right" w:leader="dot"/>
-        </w:tabs>
-        <w:spacing w:after="60"/>
-        <w:ind w:left="432"/>
-      </w:pPr>
-      <w:r>
-        <w:rPr>
-          <w:rFonts w:ascii="Arial" w:hAnsi="Arial"/>
-          <w:b w:val="0"/>
-          <w:color w:val="333333"/>
-          <w:sz w:val="21"/>
-        </w:rPr>
-        <w:t>Deep Dive — Composition, events and controlled inputs</w:t>
-        <w:tab/>
-        <w:t>52</w:t>
-      </w:r>
-    </w:p>
-    <w:p>
-      <w:pPr>
-        <w:tabs>
-          <w:tab w:pos="9072" w:val="right" w:leader="dot"/>
-        </w:tabs>
-        <w:spacing w:after="60"/>
-        <w:ind w:left="432"/>
-      </w:pPr>
-      <w:r>
-        <w:rPr>
-          <w:rFonts w:ascii="Arial" w:hAnsi="Arial"/>
-          <w:b w:val="0"/>
-          <w:color w:val="333333"/>
-          <w:sz w:val="21"/>
-        </w:rPr>
-        <w:t>Deep Dive — State: a component's memory</w:t>
-        <w:tab/>
-        <w:t>53</w:t>
-      </w:r>
-    </w:p>
-    <w:p>
-      <w:pPr>
-        <w:tabs>
-          <w:tab w:pos="9072" w:val="right" w:leader="dot"/>
-        </w:tabs>
-        <w:spacing w:after="60"/>
-        <w:ind w:left="432"/>
-      </w:pPr>
-      <w:r>
-        <w:rPr>
-          <w:rFonts w:ascii="Arial" w:hAnsi="Arial"/>
-          <w:b w:val="0"/>
-          <w:color w:val="333333"/>
-          <w:sz w:val="21"/>
-        </w:rPr>
-        <w:t>Lab 3.1 — The Real DOM, the Virtual DOM and Babel</w:t>
-        <w:tab/>
-        <w:t>54</w:t>
-      </w:r>
-    </w:p>
-    <w:p>
-      <w:pPr>
-        <w:tabs>
-          <w:tab w:pos="9072" w:val="right" w:leader="dot"/>
-        </w:tabs>
-        <w:spacing w:after="60"/>
-        <w:ind w:left="432"/>
-      </w:pPr>
-      <w:r>
-        <w:rPr>
-          <w:rFonts w:ascii="Arial" w:hAnsi="Arial"/>
-          <w:b w:val="0"/>
-          <w:color w:val="333333"/>
-          <w:sz w:val="21"/>
-        </w:rPr>
-        <w:t>Lab 3.2 — Components, Props and Composition</w:t>
-        <w:tab/>
-        <w:t>56</w:t>
-      </w:r>
-    </w:p>
-    <w:p>
-      <w:pPr>
-        <w:tabs>
-          <w:tab w:pos="9072" w:val="right" w:leader="dot"/>
-        </w:tabs>
-        <w:spacing w:after="60"/>
-        <w:ind w:left="432"/>
-      </w:pPr>
-      <w:r>
-        <w:rPr>
-          <w:rFonts w:ascii="Arial" w:hAnsi="Arial"/>
-          <w:b w:val="0"/>
-          <w:color w:val="333333"/>
-          <w:sz w:val="21"/>
-        </w:rPr>
-        <w:t>Lab 3.3 — Lists, Keys and Conditional Rendering</w:t>
-        <w:tab/>
-        <w:t>58</w:t>
-      </w:r>
-    </w:p>
-    <w:p>
-      <w:pPr>
-        <w:tabs>
-          <w:tab w:pos="9072" w:val="right" w:leader="dot"/>
-        </w:tabs>
-        <w:spacing w:after="60"/>
-        <w:ind w:left="432"/>
-      </w:pPr>
-      <w:r>
-        <w:rPr>
-          <w:rFonts w:ascii="Arial" w:hAnsi="Arial"/>
-          <w:b w:val="0"/>
-          <w:color w:val="333333"/>
-          <w:sz w:val="21"/>
-        </w:rPr>
-        <w:t>Lab 3.4 — Events, the Bakery / Cooking Filter and a Controlled Search Box</w:t>
-        <w:tab/>
-        <w:t>59</w:t>
-      </w:r>
-    </w:p>
-    <w:p>
-      <w:pPr>
-        <w:tabs>
-          <w:tab w:pos="9072" w:val="right" w:leader="dot"/>
-        </w:tabs>
-        <w:spacing w:after="60"/>
-      </w:pPr>
-      <w:r>
-        <w:rPr>
-          <w:rFonts w:ascii="Arial" w:hAnsi="Arial"/>
-          <w:b/>
-          <w:color w:val="333333"/>
-          <w:sz w:val="22"/>
-        </w:rPr>
-        <w:t>Topic 04 — React Hooks (The Vibe Way)</w:t>
-        <w:tab/>
-        <w:t>61</w:t>
-      </w:r>
-    </w:p>
-    <w:p>
-      <w:pPr>
-        <w:tabs>
-          <w:tab w:pos="9072" w:val="right" w:leader="dot"/>
-        </w:tabs>
-        <w:spacing w:after="60"/>
-        <w:ind w:left="432"/>
-      </w:pPr>
-      <w:r>
-        <w:rPr>
-          <w:rFonts w:ascii="Arial" w:hAnsi="Arial"/>
-          <w:b w:val="0"/>
-          <w:color w:val="333333"/>
-          <w:sz w:val="21"/>
-        </w:rPr>
-        <w:t>Key Concepts — Topic 04</w:t>
-        <w:tab/>
-        <w:t>61</w:t>
-      </w:r>
-    </w:p>
-    <w:p>
-      <w:pPr>
-        <w:tabs>
-          <w:tab w:pos="9072" w:val="right" w:leader="dot"/>
-        </w:tabs>
-        <w:spacing w:after="60"/>
-        <w:ind w:left="432"/>
-      </w:pPr>
-      <w:r>
-        <w:rPr>
-          <w:rFonts w:ascii="Arial" w:hAnsi="Arial"/>
-          <w:b w:val="0"/>
-          <w:color w:val="333333"/>
-          <w:sz w:val="21"/>
-        </w:rPr>
-        <w:t>Concepts Explained — Topic 04</w:t>
-        <w:tab/>
-        <w:t>62</w:t>
-      </w:r>
-    </w:p>
-    <w:p>
-      <w:pPr>
-        <w:tabs>
-          <w:tab w:pos="9072" w:val="right" w:leader="dot"/>
-        </w:tabs>
-        <w:spacing w:after="60"/>
-        <w:ind w:left="432"/>
-      </w:pPr>
-      <w:r>
-        <w:rPr>
-          <w:rFonts w:ascii="Arial" w:hAnsi="Arial"/>
-          <w:b w:val="0"/>
-          <w:color w:val="333333"/>
-          <w:sz w:val="21"/>
-        </w:rPr>
-        <w:t>Deep Dive — State is a snapshot, and updates are immutable</w:t>
-        <w:tab/>
-        <w:t>70</w:t>
-      </w:r>
-    </w:p>
-    <w:p>
-      <w:pPr>
-        <w:tabs>
-          <w:tab w:pos="9072" w:val="right" w:leader="dot"/>
-        </w:tabs>
-        <w:spacing w:after="60"/>
-        <w:ind w:left="432"/>
-      </w:pPr>
-      <w:r>
-        <w:rPr>
-          <w:rFonts w:ascii="Arial" w:hAnsi="Arial"/>
-          <w:b w:val="0"/>
-          <w:color w:val="333333"/>
-          <w:sz w:val="21"/>
-        </w:rPr>
-        <w:t>Deep Dive — useEffect: dependencies, cleanup and StrictMode</w:t>
-        <w:tab/>
-        <w:t>71</w:t>
-      </w:r>
-    </w:p>
-    <w:p>
-      <w:pPr>
-        <w:tabs>
-          <w:tab w:pos="9072" w:val="right" w:leader="dot"/>
-        </w:tabs>
-        <w:spacing w:after="60"/>
-        <w:ind w:left="432"/>
-      </w:pPr>
-      <w:r>
-        <w:rPr>
-          <w:rFonts w:ascii="Arial" w:hAnsi="Arial"/>
-          <w:b w:val="0"/>
-          <w:color w:val="333333"/>
-          <w:sz w:val="21"/>
-        </w:rPr>
-        <w:t>Deep Dive — useRef: two jobs, and the dividing line against state</w:t>
-        <w:tab/>
-        <w:t>72</w:t>
-      </w:r>
-    </w:p>
-    <w:p>
-      <w:pPr>
-        <w:tabs>
-          <w:tab w:pos="9072" w:val="right" w:leader="dot"/>
-        </w:tabs>
-        <w:spacing w:after="60"/>
-        <w:ind w:left="432"/>
-      </w:pPr>
-      <w:r>
-        <w:rPr>
-          <w:rFonts w:ascii="Arial" w:hAnsi="Arial"/>
-          <w:b w:val="0"/>
-          <w:color w:val="333333"/>
-          <w:sz w:val="21"/>
-        </w:rPr>
-        <w:t>Deep Dive — Context, reducers and custom hooks</w:t>
-        <w:tab/>
-        <w:t>73</w:t>
-      </w:r>
-    </w:p>
-    <w:p>
-      <w:pPr>
-        <w:tabs>
-          <w:tab w:pos="9072" w:val="right" w:leader="dot"/>
-        </w:tabs>
-        <w:spacing w:after="60"/>
-        <w:ind w:left="432"/>
-      </w:pPr>
-      <w:r>
-        <w:rPr>
-          <w:rFonts w:ascii="Arial" w:hAnsi="Arial"/>
-          <w:b w:val="0"/>
-          <w:color w:val="333333"/>
-          <w:sz w:val="21"/>
-        </w:rPr>
-        <w:t>Deep Dive — What a hook is, and why the rules exist</w:t>
-        <w:tab/>
-        <w:t>74</w:t>
-      </w:r>
-    </w:p>
-    <w:p>
-      <w:pPr>
-        <w:tabs>
-          <w:tab w:pos="9072" w:val="right" w:leader="dot"/>
-        </w:tabs>
-        <w:spacing w:after="60"/>
-        <w:ind w:left="432"/>
-      </w:pPr>
-      <w:r>
-        <w:rPr>
-          <w:rFonts w:ascii="Arial" w:hAnsi="Arial"/>
-          <w:b w:val="0"/>
-          <w:color w:val="333333"/>
-          <w:sz w:val="21"/>
-        </w:rPr>
-        <w:t>Lab 4.1 — useState — State, Snapshots and Immutability</w:t>
-        <w:tab/>
-        <w:t>75</w:t>
-      </w:r>
-    </w:p>
-    <w:p>
-      <w:pPr>
-        <w:tabs>
-          <w:tab w:pos="9072" w:val="right" w:leader="dot"/>
-        </w:tabs>
-        <w:spacing w:after="60"/>
-        <w:ind w:left="432"/>
-      </w:pPr>
-      <w:r>
-        <w:rPr>
-          <w:rFonts w:ascii="Arial" w:hAnsi="Arial"/>
-          <w:b w:val="0"/>
-          <w:color w:val="333333"/>
-          <w:sz w:val="21"/>
-        </w:rPr>
-        <w:t>Lab 4.2 — useEffect — Side Effects and Cleanup</w:t>
-        <w:tab/>
-        <w:t>77</w:t>
-      </w:r>
-    </w:p>
-    <w:p>
-      <w:pPr>
-        <w:tabs>
-          <w:tab w:pos="9072" w:val="right" w:leader="dot"/>
-        </w:tabs>
-        <w:spacing w:after="60"/>
-        <w:ind w:left="432"/>
-      </w:pPr>
-      <w:r>
-        <w:rPr>
-          <w:rFonts w:ascii="Arial" w:hAnsi="Arial"/>
-          <w:b w:val="0"/>
-          <w:color w:val="333333"/>
-          <w:sz w:val="21"/>
-        </w:rPr>
-        <w:t>Lab 4.3 — useRef — The DOM Escape Hatch, and What Is NOT State</w:t>
-        <w:tab/>
-        <w:t>78</w:t>
-      </w:r>
-    </w:p>
-    <w:p>
-      <w:pPr>
-        <w:tabs>
-          <w:tab w:pos="9072" w:val="right" w:leader="dot"/>
-        </w:tabs>
-        <w:spacing w:after="60"/>
-        <w:ind w:left="432"/>
-      </w:pPr>
-      <w:r>
-        <w:rPr>
-          <w:rFonts w:ascii="Arial" w:hAnsi="Arial"/>
-          <w:b w:val="0"/>
-          <w:color w:val="333333"/>
-          <w:sz w:val="21"/>
-        </w:rPr>
-        <w:t>Lab 4.4 — useContext and useReducer — State Without Prop Drilling</w:t>
-        <w:tab/>
-        <w:t>81</w:t>
-      </w:r>
-    </w:p>
-    <w:p>
-      <w:pPr>
-        <w:tabs>
-          <w:tab w:pos="9072" w:val="right" w:leader="dot"/>
-        </w:tabs>
-        <w:spacing w:after="60"/>
-        <w:ind w:left="432"/>
-      </w:pPr>
-      <w:r>
-        <w:rPr>
-          <w:rFonts w:ascii="Arial" w:hAnsi="Arial"/>
-          <w:b w:val="0"/>
-          <w:color w:val="333333"/>
-          <w:sz w:val="21"/>
-        </w:rPr>
-        <w:t>Lab 4.5 — Custom Hooks — Sharing Logic, Not State</w:t>
-        <w:tab/>
-        <w:t>83</w:t>
-      </w:r>
-    </w:p>
-    <w:p>
-      <w:pPr>
-        <w:tabs>
-          <w:tab w:pos="9072" w:val="right" w:leader="dot"/>
-        </w:tabs>
-        <w:spacing w:after="60"/>
-      </w:pPr>
-      <w:r>
-        <w:rPr>
-          <w:rFonts w:ascii="Arial" w:hAnsi="Arial"/>
-          <w:b/>
-          <w:color w:val="333333"/>
-          <w:sz w:val="22"/>
-        </w:rPr>
-        <w:t>Topic 05 — Giving Your App a Backend API and a Database</w:t>
-        <w:tab/>
-        <w:t>85</w:t>
-      </w:r>
-    </w:p>
-    <w:p>
-      <w:pPr>
-        <w:tabs>
-          <w:tab w:pos="9072" w:val="right" w:leader="dot"/>
-        </w:tabs>
-        <w:spacing w:after="60"/>
-        <w:ind w:left="432"/>
-      </w:pPr>
-      <w:r>
-        <w:rPr>
-          <w:rFonts w:ascii="Arial" w:hAnsi="Arial"/>
-          <w:b w:val="0"/>
-          <w:color w:val="333333"/>
-          <w:sz w:val="21"/>
-        </w:rPr>
-        <w:t>Key Concepts — Topic 05</w:t>
-        <w:tab/>
-        <w:t>86</w:t>
-      </w:r>
-    </w:p>
-    <w:p>
-      <w:pPr>
-        <w:tabs>
-          <w:tab w:pos="9072" w:val="right" w:leader="dot"/>
-        </w:tabs>
-        <w:spacing w:after="60"/>
-        <w:ind w:left="432"/>
-      </w:pPr>
-      <w:r>
-        <w:rPr>
-          <w:rFonts w:ascii="Arial" w:hAnsi="Arial"/>
-          <w:b w:val="0"/>
-          <w:color w:val="333333"/>
-          <w:sz w:val="21"/>
-        </w:rPr>
-        <w:t>Concepts Explained — Topic 05</w:t>
-        <w:tab/>
-        <w:t>86</w:t>
-      </w:r>
-    </w:p>
-    <w:p>
-      <w:pPr>
-        <w:tabs>
-          <w:tab w:pos="9072" w:val="right" w:leader="dot"/>
-        </w:tabs>
-        <w:spacing w:after="60"/>
-        <w:ind w:left="432"/>
-      </w:pPr>
-      <w:r>
-        <w:rPr>
-          <w:rFonts w:ascii="Arial" w:hAnsi="Arial"/>
-          <w:b w:val="0"/>
-          <w:color w:val="333333"/>
-          <w:sz w:val="21"/>
-        </w:rPr>
-        <w:t>Deep Dive — Three tiers: why the browser never touches Postgres</w:t>
-        <w:tab/>
-        <w:t>93</w:t>
-      </w:r>
-    </w:p>
-    <w:p>
-      <w:pPr>
-        <w:tabs>
-          <w:tab w:pos="9072" w:val="right" w:leader="dot"/>
-        </w:tabs>
-        <w:spacing w:after="60"/>
-        <w:ind w:left="432"/>
-      </w:pPr>
-      <w:r>
-        <w:rPr>
-          <w:rFonts w:ascii="Arial" w:hAnsi="Arial"/>
-          <w:b w:val="0"/>
-          <w:color w:val="333333"/>
-          <w:sz w:val="21"/>
-        </w:rPr>
-        <w:t>Deep Dive — Serverless API routes and parameterised SQL</w:t>
-        <w:tab/>
-        <w:t>94</w:t>
-      </w:r>
-    </w:p>
-    <w:p>
-      <w:pPr>
-        <w:tabs>
-          <w:tab w:pos="9072" w:val="right" w:leader="dot"/>
-        </w:tabs>
-        <w:spacing w:after="60"/>
-        <w:ind w:left="432"/>
-      </w:pPr>
-      <w:r>
-        <w:rPr>
-          <w:rFonts w:ascii="Arial" w:hAnsi="Arial"/>
-          <w:b w:val="0"/>
-          <w:color w:val="333333"/>
-          <w:sz w:val="21"/>
-        </w:rPr>
-        <w:t>Deep Dive — Passwords, tokens, and enforcing ownership in SQL</w:t>
-        <w:tab/>
-        <w:t>95</w:t>
-      </w:r>
-    </w:p>
-    <w:p>
-      <w:pPr>
-        <w:tabs>
-          <w:tab w:pos="9072" w:val="right" w:leader="dot"/>
-        </w:tabs>
-        <w:spacing w:after="60"/>
-        <w:ind w:left="432"/>
-      </w:pPr>
-      <w:r>
-        <w:rPr>
-          <w:rFonts w:ascii="Arial" w:hAnsi="Arial"/>
-          <w:b w:val="0"/>
-          <w:color w:val="333333"/>
-          <w:sz w:val="21"/>
-        </w:rPr>
-        <w:t>Deep Dive — The three states of a fetch, and response.ok</w:t>
-        <w:tab/>
-        <w:t>97</w:t>
-      </w:r>
-    </w:p>
-    <w:p>
-      <w:pPr>
-        <w:tabs>
-          <w:tab w:pos="9072" w:val="right" w:leader="dot"/>
-        </w:tabs>
-        <w:spacing w:after="60"/>
-        <w:ind w:left="432"/>
-      </w:pPr>
-      <w:r>
-        <w:rPr>
-          <w:rFonts w:ascii="Arial" w:hAnsi="Arial"/>
-          <w:b w:val="0"/>
-          <w:color w:val="333333"/>
-          <w:sz w:val="21"/>
-        </w:rPr>
-        <w:t>Lab 5.1 — The Three Tiers — Your First API Routes over Neon</w:t>
-        <w:tab/>
-        <w:t>98</w:t>
-      </w:r>
-    </w:p>
-    <w:p>
-      <w:pPr>
-        <w:tabs>
-          <w:tab w:pos="9072" w:val="right" w:leader="dot"/>
-        </w:tabs>
-        <w:spacing w:after="60"/>
-        <w:ind w:left="432"/>
-      </w:pPr>
-      <w:r>
-        <w:rPr>
-          <w:rFonts w:ascii="Arial" w:hAnsi="Arial"/>
-          <w:b w:val="0"/>
-          <w:color w:val="333333"/>
-          <w:sz w:val="21"/>
-        </w:rPr>
-        <w:t>Lab 5.2 — Fetch the Catalogue From React — Loading, Error and Success</w:t>
-        <w:tab/>
-        <w:t>102</w:t>
-      </w:r>
-    </w:p>
-    <w:p>
-      <w:pPr>
-        <w:tabs>
-          <w:tab w:pos="9072" w:val="right" w:leader="dot"/>
-        </w:tabs>
-        <w:spacing w:after="60"/>
-        <w:ind w:left="432"/>
-      </w:pPr>
-      <w:r>
-        <w:rPr>
-          <w:rFonts w:ascii="Arial" w:hAnsi="Arial"/>
-          <w:b w:val="0"/>
-          <w:color w:val="333333"/>
-          <w:sz w:val="21"/>
-        </w:rPr>
-        <w:t>Lab 5.3 — Accounts — Password Hashing with bcrypt, Sessions with JWT</w:t>
-        <w:tab/>
-        <w:t>105</w:t>
-      </w:r>
-    </w:p>
-    <w:p>
-      <w:pPr>
-        <w:tabs>
-          <w:tab w:pos="9072" w:val="right" w:leader="dot"/>
-        </w:tabs>
-        <w:spacing w:after="60"/>
-        <w:ind w:left="432"/>
-      </w:pPr>
-      <w:r>
-        <w:rPr>
-          <w:rFonts w:ascii="Arial" w:hAnsi="Arial"/>
-          <w:b w:val="0"/>
-          <w:color w:val="333333"/>
-          <w:sz w:val="21"/>
-        </w:rPr>
-        <w:t>Lab 5.4 — Protected CRUD — Enrolments Scoped to the Signed-in User</w:t>
-        <w:tab/>
-        <w:t>107</w:t>
-      </w:r>
-    </w:p>
-    <w:p>
-      <w:pPr>
-        <w:tabs>
-          <w:tab w:pos="9072" w:val="right" w:leader="dot"/>
-        </w:tabs>
-        <w:spacing w:after="60"/>
-      </w:pPr>
-      <w:r>
-        <w:rPr>
-          <w:rFonts w:ascii="Arial" w:hAnsi="Arial"/>
-          <w:b/>
-          <w:color w:val="333333"/>
-          <w:sz w:val="22"/>
-        </w:rPr>
-        <w:t>Topic 06 — React Router for Real App Navigation</w:t>
-        <w:tab/>
-        <w:t>109</w:t>
-      </w:r>
-    </w:p>
-    <w:p>
-      <w:pPr>
-        <w:tabs>
-          <w:tab w:pos="9072" w:val="right" w:leader="dot"/>
-        </w:tabs>
-        <w:spacing w:after="60"/>
-        <w:ind w:left="432"/>
-      </w:pPr>
-      <w:r>
-        <w:rPr>
-          <w:rFonts w:ascii="Arial" w:hAnsi="Arial"/>
-          <w:b w:val="0"/>
-          <w:color w:val="333333"/>
-          <w:sz w:val="21"/>
-        </w:rPr>
-        <w:t>Key Concepts — Topic 06</w:t>
-        <w:tab/>
-        <w:t>109</w:t>
-      </w:r>
-    </w:p>
-    <w:p>
-      <w:pPr>
-        <w:tabs>
-          <w:tab w:pos="9072" w:val="right" w:leader="dot"/>
-        </w:tabs>
-        <w:spacing w:after="60"/>
-        <w:ind w:left="432"/>
-      </w:pPr>
-      <w:r>
-        <w:rPr>
-          <w:rFonts w:ascii="Arial" w:hAnsi="Arial"/>
-          <w:b w:val="0"/>
-          <w:color w:val="333333"/>
-          <w:sz w:val="21"/>
-        </w:rPr>
-        <w:t>Concepts Explained — Topic 06</w:t>
-        <w:tab/>
-        <w:t>110</w:t>
-      </w:r>
-    </w:p>
-    <w:p>
-      <w:pPr>
-        <w:tabs>
-          <w:tab w:pos="9072" w:val="right" w:leader="dot"/>
-        </w:tabs>
-        <w:spacing w:after="60"/>
-        <w:ind w:left="432"/>
-      </w:pPr>
-      <w:r>
-        <w:rPr>
-          <w:rFonts w:ascii="Arial" w:hAnsi="Arial"/>
-          <w:b w:val="0"/>
-          <w:color w:val="333333"/>
-          <w:sz w:val="21"/>
-        </w:rPr>
-        <w:t>Deep Dive — Single-page apps and client-side routing</w:t>
-        <w:tab/>
-        <w:t>115</w:t>
-      </w:r>
-    </w:p>
-    <w:p>
-      <w:pPr>
-        <w:tabs>
-          <w:tab w:pos="9072" w:val="right" w:leader="dot"/>
-        </w:tabs>
-        <w:spacing w:after="60"/>
-        <w:ind w:left="432"/>
-      </w:pPr>
-      <w:r>
-        <w:rPr>
-          <w:rFonts w:ascii="Arial" w:hAnsi="Arial"/>
-          <w:b w:val="0"/>
-          <w:color w:val="333333"/>
-          <w:sz w:val="21"/>
-        </w:rPr>
-        <w:t>Deep Dive — Layouts, dynamic params and URL state</w:t>
-        <w:tab/>
-        <w:t>115</w:t>
-      </w:r>
-    </w:p>
-    <w:p>
-      <w:pPr>
-        <w:tabs>
-          <w:tab w:pos="9072" w:val="right" w:leader="dot"/>
-        </w:tabs>
-        <w:spacing w:after="60"/>
-        <w:ind w:left="432"/>
-      </w:pPr>
-      <w:r>
-        <w:rPr>
-          <w:rFonts w:ascii="Arial" w:hAnsi="Arial"/>
-          <w:b w:val="0"/>
-          <w:color w:val="333333"/>
-          <w:sz w:val="21"/>
-        </w:rPr>
-        <w:t>Deep Dive — Protected routes, and why a client guard is not security</w:t>
-        <w:tab/>
-        <w:t>117</w:t>
-      </w:r>
-    </w:p>
-    <w:p>
-      <w:pPr>
-        <w:tabs>
-          <w:tab w:pos="9072" w:val="right" w:leader="dot"/>
-        </w:tabs>
-        <w:spacing w:after="60"/>
-        <w:ind w:left="432"/>
-      </w:pPr>
-      <w:r>
-        <w:rPr>
-          <w:rFonts w:ascii="Arial" w:hAnsi="Arial"/>
-          <w:b w:val="0"/>
-          <w:color w:val="333333"/>
-          <w:sz w:val="21"/>
-        </w:rPr>
-        <w:t>Lab 6.1 — Routes, Links and Layout Routes</w:t>
-        <w:tab/>
-        <w:t>118</w:t>
-      </w:r>
-    </w:p>
-    <w:p>
-      <w:pPr>
-        <w:tabs>
-          <w:tab w:pos="9072" w:val="right" w:leader="dot"/>
-        </w:tabs>
-        <w:spacing w:after="60"/>
-        <w:ind w:left="432"/>
-      </w:pPr>
-      <w:r>
-        <w:rPr>
-          <w:rFonts w:ascii="Arial" w:hAnsi="Arial"/>
-          <w:b w:val="0"/>
-          <w:color w:val="333333"/>
-          <w:sz w:val="21"/>
-        </w:rPr>
-        <w:t>Lab 6.2 — Dynamic Routes, URL State and 404s</w:t>
-        <w:tab/>
-        <w:t>120</w:t>
-      </w:r>
-    </w:p>
-    <w:p>
-      <w:pPr>
-        <w:tabs>
-          <w:tab w:pos="9072" w:val="right" w:leader="dot"/>
-        </w:tabs>
-        <w:spacing w:after="60"/>
-        <w:ind w:left="432"/>
-      </w:pPr>
-      <w:r>
-        <w:rPr>
-          <w:rFonts w:ascii="Arial" w:hAnsi="Arial"/>
-          <w:b w:val="0"/>
-          <w:color w:val="333333"/>
-          <w:sz w:val="21"/>
-        </w:rPr>
-        <w:t>Lab 6.3 — Protected Routes and the Student Dashboard</w:t>
-        <w:tab/>
-        <w:t>121</w:t>
-      </w:r>
-    </w:p>
-    <w:p>
-      <w:pPr>
-        <w:tabs>
-          <w:tab w:pos="9072" w:val="right" w:leader="dot"/>
-        </w:tabs>
-        <w:spacing w:after="60"/>
-        <w:ind w:left="432"/>
-      </w:pPr>
-      <w:r>
-        <w:rPr>
-          <w:rFonts w:ascii="Arial" w:hAnsi="Arial"/>
-          <w:b w:val="0"/>
-          <w:color w:val="333333"/>
-          <w:sz w:val="21"/>
-        </w:rPr>
-        <w:t>Lab 6.4 — Capstone — Assemble the Full-Stack App</w:t>
-        <w:tab/>
-        <w:t>123</w:t>
-      </w:r>
-    </w:p>
-    <w:p>
-      <w:pPr>
-        <w:tabs>
-          <w:tab w:pos="9072" w:val="right" w:leader="dot"/>
-        </w:tabs>
-        <w:spacing w:after="60"/>
-        <w:ind w:left="432"/>
-      </w:pPr>
-      <w:r>
-        <w:rPr>
-          <w:rFonts w:ascii="Arial" w:hAnsi="Arial"/>
-          <w:b w:val="0"/>
-          <w:color w:val="333333"/>
-          <w:sz w:val="21"/>
-        </w:rPr>
-        <w:t>Lab 6.5 — Deploy the Full-Stack App to Vercel and Neon</w:t>
-        <w:tab/>
-        <w:t>125</w:t>
-      </w:r>
-    </w:p>
-    <w:p>
-      <w:pPr>
-        <w:tabs>
-          <w:tab w:pos="9072" w:val="right" w:leader="dot"/>
-        </w:tabs>
-        <w:spacing w:after="60"/>
-        <w:ind w:left="432"/>
-      </w:pPr>
-      <w:r>
-        <w:rPr>
-          <w:rFonts w:ascii="Arial" w:hAnsi="Arial"/>
-          <w:b w:val="0"/>
-          <w:color w:val="333333"/>
-          <w:sz w:val="21"/>
-        </w:rPr>
-        <w:t>Lab 6.6 — Mini-Capstone — Add Course Reviews, On Your Own</w:t>
-        <w:tab/>
-        <w:t>127</w:t>
-      </w:r>
-    </w:p>
-    <w:p>
-      <w:pPr>
-        <w:tabs>
-          <w:tab w:pos="9072" w:val="right" w:leader="dot"/>
-        </w:tabs>
-        <w:spacing w:after="60"/>
-      </w:pPr>
-      <w:r>
-        <w:rPr>
-          <w:rFonts w:ascii="Arial" w:hAnsi="Arial"/>
-          <w:b/>
-          <w:color w:val="333333"/>
-          <w:sz w:val="22"/>
-        </w:rPr>
-        <w:t>Appendix A — The AI React Bug Checklist</w:t>
-        <w:tab/>
-        <w:t>130</w:t>
-      </w:r>
-    </w:p>
-    <w:p>
-      <w:pPr>
-        <w:tabs>
-          <w:tab w:pos="9072" w:val="right" w:leader="dot"/>
-        </w:tabs>
-        <w:spacing w:after="60"/>
-      </w:pPr>
-      <w:r>
-        <w:rPr>
-          <w:rFonts w:ascii="Arial" w:hAnsi="Arial"/>
-          <w:b/>
-          <w:color w:val="333333"/>
-          <w:sz w:val="22"/>
-        </w:rPr>
-        <w:t>Appendix B — Troubleshooting</w:t>
-        <w:tab/>
-        <w:t>131</w:t>
-      </w:r>
-    </w:p>
-    <w:p>
-      <w:pPr>
-        <w:tabs>
-          <w:tab w:pos="9072" w:val="right" w:leader="dot"/>
-        </w:tabs>
-        <w:spacing w:after="60"/>
-      </w:pPr>
-      <w:r>
-        <w:rPr>
-          <w:rFonts w:ascii="Arial" w:hAnsi="Arial"/>
-          <w:b/>
-          <w:color w:val="333333"/>
-          <w:sz w:val="22"/>
-        </w:rPr>
-        <w:t>Appendix C — Glossary</w:t>
-        <w:tab/>
-        <w:t>132</w:t>
+      <w:r>
+        <w:fldChar w:fldCharType="begin"/>
+        <w:instrText xml:space="preserve">TOC \o "1-3" \h \z \u</w:instrText>
+        <w:fldChar w:fldCharType="separate"/>
+        <w:t>Right-click and choose “Update Field”, or press F9, to build the table of contents.</w:t>
+        <w:fldChar w:fldCharType="end"/>
       </w:r>
     </w:p>
     <w:p>
@@ -18690,17 +17151,17 @@
         <w:pStyle w:val="Heading2"/>
       </w:pPr>
       <w:r>
-        <w:t>Lab 5.1 — The Three Tiers — Your First API Routes over Neon</w:t>
-      </w:r>
-    </w:p>
-    <w:p>
-      <w:r>
-        <w:t>Objective: stand up Neon Postgres, put a serverless API tier in front of it, and prove it cannot be injected.</w:t>
-      </w:r>
-    </w:p>
-    <w:p>
-      <w:r>
-        <w:t>Goal: The 20 courses live in a JavaScript array. The learner creates a Neon Postgres project, runs the real schema, and writes the first serverless routes — GET /api/courses and the dynamic /api/courses/[slug] — then attacks the slug route with a real injection payload and watches the tagged template bounce it. The architectural rule is drilled here: the browser NEVER talks to Postgres.</w:t>
+        <w:t>Lab 5.1 — Three Tiers — A Neon Database and Your First API Route</w:t>
+      </w:r>
+    </w:p>
+    <w:p>
+      <w:r>
+        <w:t>Objective: stand up Neon Postgres and put a serverless API tier in front of it.</w:t>
+      </w:r>
+    </w:p>
+    <w:p>
+      <w:r>
+        <w:t>Goal: The 20 courses live in a JavaScript array. The learner creates a Neon Postgres project, runs the real schema, and writes the first Vercel serverless function — GET /api/courses — reading it. The architectural rule is drilled here: the browser NEVER talks to Postgres, and DATABASE_URL must never carry a VITE_ prefix, because a VITE_ variable is compiled into the bundle every visitor downloads.</w:t>
       </w:r>
     </w:p>
     <w:p>
@@ -18715,7 +17176,7 @@
     </w:p>
     <w:p>
       <w:r>
-        <w:t>A live Neon database (20 courses seeded) behind api/_lib/db.js, api/courses/index.js and api/courses/[slug].js — tested with curl and a real injection probe   (Tech &amp; files: Neon Postgres, @neondatabase/serverless, Vercel Functions, vercel dev, tagged templates, .env.local.)</w:t>
+        <w:t>A live Neon database with users, courses (20 seeded), enrollments and reviews — plus api/_lib/db.js and api/courses/index.js   (Tech &amp; files: Neon Postgres, @neondatabase/serverless, Vercel Functions, vercel dev, .env.local.)</w:t>
       </w:r>
     </w:p>
     <w:p>
@@ -19116,328 +17577,6 @@
       </w:r>
     </w:p>
     <w:p>
-      <w:pPr>
-        <w:pStyle w:val="ListNumber"/>
-      </w:pPr>
-      <w:r>
-        <w:t>Add the dynamic route. The [slug] in the FILENAME is what makes it dynamic; Vercel hands you req.query.slug</w:t>
-      </w:r>
-    </w:p>
-    <w:p>
-      <w:r>
-        <w:rPr>
-          <w:rFonts w:ascii="Consolas" w:hAnsi="Consolas"/>
-          <w:color w:val="0B3060"/>
-          <w:sz w:val="19"/>
-        </w:rPr>
-        <w:t>// api/courses/[slug].js  -&gt;  GET /api/courses/artisan-sourdough-bread-baking</w:t>
-      </w:r>
-    </w:p>
-    <w:p>
-      <w:r>
-        <w:rPr>
-          <w:rFonts w:ascii="Consolas" w:hAnsi="Consolas"/>
-          <w:color w:val="0B3060"/>
-          <w:sz w:val="19"/>
-        </w:rPr>
-        <w:t>const { slug } = req.query ?? {}</w:t>
-      </w:r>
-    </w:p>
-    <w:p>
-      <w:pPr>
-        <w:pStyle w:val="ListNumber"/>
-      </w:pPr>
-      <w:r>
-        <w:t>Query with the tagged template — note there are NO parentheses. sql`...`, not sql("...")</w:t>
-      </w:r>
-    </w:p>
-    <w:p>
-      <w:r>
-        <w:rPr>
-          <w:rFonts w:ascii="Consolas" w:hAnsi="Consolas"/>
-          <w:color w:val="0B3060"/>
-          <w:sz w:val="19"/>
-        </w:rPr>
-        <w:t>const rows = await sql`</w:t>
-      </w:r>
-    </w:p>
-    <w:p>
-      <w:r>
-        <w:rPr>
-          <w:rFonts w:ascii="Consolas" w:hAnsi="Consolas"/>
-          <w:color w:val="0B3060"/>
-          <w:sz w:val="19"/>
-        </w:rPr>
-        <w:t xml:space="preserve">  select id::int as id, code, slug, title, category, level,</w:t>
-      </w:r>
-    </w:p>
-    <w:p>
-      <w:r>
-        <w:rPr>
-          <w:rFonts w:ascii="Consolas" w:hAnsi="Consolas"/>
-          <w:color w:val="0B3060"/>
-          <w:sz w:val="19"/>
-        </w:rPr>
-        <w:t xml:space="preserve">         fee::float8 as fee, weeks, campus, summary, emoji, image</w:t>
-      </w:r>
-    </w:p>
-    <w:p>
-      <w:r>
-        <w:rPr>
-          <w:rFonts w:ascii="Consolas" w:hAnsi="Consolas"/>
-          <w:color w:val="0B3060"/>
-          <w:sz w:val="19"/>
-        </w:rPr>
-        <w:t xml:space="preserve">  from courses</w:t>
-      </w:r>
-    </w:p>
-    <w:p>
-      <w:r>
-        <w:rPr>
-          <w:rFonts w:ascii="Consolas" w:hAnsi="Consolas"/>
-          <w:color w:val="0B3060"/>
-          <w:sz w:val="19"/>
-        </w:rPr>
-        <w:t xml:space="preserve">  where slug = ${slug}</w:t>
-      </w:r>
-    </w:p>
-    <w:p>
-      <w:r>
-        <w:rPr>
-          <w:rFonts w:ascii="Consolas" w:hAnsi="Consolas"/>
-          <w:color w:val="0B3060"/>
-          <w:sz w:val="19"/>
-        </w:rPr>
-        <w:t>`</w:t>
-      </w:r>
-    </w:p>
-    <w:p>
-      <w:pPr>
-        <w:pStyle w:val="ListNumber"/>
-      </w:pPr>
-      <w:r>
-        <w:t>Understand WHY that is safe. It looks like string interpolation and is not</w:t>
-      </w:r>
-    </w:p>
-    <w:p>
-      <w:r>
-        <w:rPr>
-          <w:rFonts w:ascii="Consolas" w:hAnsi="Consolas"/>
-          <w:color w:val="0B3060"/>
-          <w:sz w:val="19"/>
-        </w:rPr>
-        <w:t>// The driver sends the query TEXT and the VALUES to Postgres separately, as a</w:t>
-      </w:r>
-    </w:p>
-    <w:p>
-      <w:r>
-        <w:rPr>
-          <w:rFonts w:ascii="Consolas" w:hAnsi="Consolas"/>
-          <w:color w:val="0B3060"/>
-          <w:sz w:val="19"/>
-        </w:rPr>
-        <w:t>// parameterised query ($1). Postgres parses the SQL FIRST and only then binds</w:t>
-      </w:r>
-    </w:p>
-    <w:p>
-      <w:r>
-        <w:rPr>
-          <w:rFonts w:ascii="Consolas" w:hAnsi="Consolas"/>
-          <w:color w:val="0B3060"/>
-          <w:sz w:val="19"/>
-        </w:rPr>
-        <w:t>// the value. A value can therefore never become SQL. Injection is impossible.</w:t>
-      </w:r>
-    </w:p>
-    <w:p>
-      <w:pPr>
-        <w:pStyle w:val="ListNumber"/>
-      </w:pPr>
-      <w:r>
-        <w:t>PROBE IT. Attack your own API with a classic payload and watch it do nothing at all</w:t>
-      </w:r>
-    </w:p>
-    <w:p>
-      <w:r>
-        <w:rPr>
-          <w:rFonts w:ascii="Consolas" w:hAnsi="Consolas"/>
-          <w:color w:val="0B3060"/>
-          <w:sz w:val="19"/>
-        </w:rPr>
-        <w:t>curl "http://localhost:3000/api/courses/x'%20or%20'1'='1"</w:t>
-      </w:r>
-    </w:p>
-    <w:p>
-      <w:r>
-        <w:rPr>
-          <w:rFonts w:ascii="Consolas" w:hAnsi="Consolas"/>
-          <w:color w:val="0B3060"/>
-          <w:sz w:val="19"/>
-        </w:rPr>
-        <w:t># -&gt; 404 {"error":"No course found at /courses/x' or '1'='1."}</w:t>
-      </w:r>
-    </w:p>
-    <w:p>
-      <w:r>
-        <w:rPr>
-          <w:rFonts w:ascii="Consolas" w:hAnsi="Consolas"/>
-          <w:color w:val="0B3060"/>
-          <w:sz w:val="19"/>
-        </w:rPr>
-        <w:t># Postgres looked for a course whose slug is literally  x' or '1'='1  — and there isn't one.</w:t>
-      </w:r>
-    </w:p>
-    <w:p>
-      <w:pPr>
-        <w:pStyle w:val="ListNumber"/>
-      </w:pPr>
-      <w:r>
-        <w:t>Now write the version that is wrong, and see the difference in ONE line of code</w:t>
-      </w:r>
-    </w:p>
-    <w:p>
-      <w:r>
-        <w:rPr>
-          <w:rFonts w:ascii="Consolas" w:hAnsi="Consolas"/>
-          <w:color w:val="0B3060"/>
-          <w:sz w:val="19"/>
-        </w:rPr>
-        <w:t>// ⛔ NEVER. This builds a STRING, so the payload becomes part of the SQL:</w:t>
-      </w:r>
-    </w:p>
-    <w:p>
-      <w:r>
-        <w:rPr>
-          <w:rFonts w:ascii="Consolas" w:hAnsi="Consolas"/>
-          <w:color w:val="0B3060"/>
-          <w:sz w:val="19"/>
-        </w:rPr>
-        <w:t>// await sql(`select * from courses where slug = '${slug}'`)</w:t>
-      </w:r>
-    </w:p>
-    <w:p>
-      <w:r>
-        <w:rPr>
-          <w:rFonts w:ascii="Consolas" w:hAnsi="Consolas"/>
-          <w:color w:val="0B3060"/>
-          <w:sz w:val="19"/>
-        </w:rPr>
-        <w:t>//   slug = "x'; drop table users; --"   -&gt;  you no longer have a users table.</w:t>
-      </w:r>
-    </w:p>
-    <w:p>
-      <w:pPr>
-        <w:pStyle w:val="ListNumber"/>
-      </w:pPr>
-      <w:r>
-        <w:t>Delete the unsafe line. The rule: user input is always a ${} placeholder, never part of the query string</w:t>
-      </w:r>
-    </w:p>
-    <w:p>
-      <w:pPr>
-        <w:pStyle w:val="ListNumber"/>
-      </w:pPr>
-      <w:r>
-        <w:t>Return a real 404 when no row matches — the STATUS CODE is the API's answer, not a 200 with null</w:t>
-      </w:r>
-    </w:p>
-    <w:p>
-      <w:r>
-        <w:rPr>
-          <w:rFonts w:ascii="Consolas" w:hAnsi="Consolas"/>
-          <w:color w:val="0B3060"/>
-          <w:sz w:val="19"/>
-        </w:rPr>
-        <w:t>if (rows.length === 0) {</w:t>
-      </w:r>
-    </w:p>
-    <w:p>
-      <w:r>
-        <w:rPr>
-          <w:rFonts w:ascii="Consolas" w:hAnsi="Consolas"/>
-          <w:color w:val="0B3060"/>
-          <w:sz w:val="19"/>
-        </w:rPr>
-        <w:t xml:space="preserve">  throw new HttpError(404, `No course found at /courses/${slug}.`)</w:t>
-      </w:r>
-    </w:p>
-    <w:p>
-      <w:r>
-        <w:rPr>
-          <w:rFonts w:ascii="Consolas" w:hAnsi="Consolas"/>
-          <w:color w:val="0B3060"/>
-          <w:sz w:val="19"/>
-        </w:rPr>
-        <w:t>}</w:t>
-      </w:r>
-    </w:p>
-    <w:p>
-      <w:pPr>
-        <w:pStyle w:val="ListNumber"/>
-      </w:pPr>
-      <w:r>
-        <w:t>Prompt the agent for the shared error plumbing so every route answers the same way</w:t>
-      </w:r>
-    </w:p>
-    <w:p>
-      <w:r>
-        <w:rPr>
-          <w:rFonts w:ascii="Consolas" w:hAnsi="Consolas"/>
-          <w:color w:val="0B3060"/>
-          <w:sz w:val="19"/>
-        </w:rPr>
-        <w:t>// Vibe prompt: 'In api/_lib/auth.js add an HttpError class (status + message),</w:t>
-      </w:r>
-    </w:p>
-    <w:p>
-      <w:r>
-        <w:rPr>
-          <w:rFonts w:ascii="Consolas" w:hAnsi="Consolas"/>
-          <w:color w:val="0B3060"/>
-          <w:sz w:val="19"/>
-        </w:rPr>
-        <w:t>// a sendError(res, err) that maps HttpError to its status and ANY other error to</w:t>
-      </w:r>
-    </w:p>
-    <w:p>
-      <w:r>
-        <w:rPr>
-          <w:rFonts w:ascii="Consolas" w:hAnsi="Consolas"/>
-          <w:color w:val="0B3060"/>
-          <w:sz w:val="19"/>
-        </w:rPr>
-        <w:t>// a generic 500 (never leak a stack trace or a SQL error naming our columns),</w:t>
-      </w:r>
-    </w:p>
-    <w:p>
-      <w:r>
-        <w:rPr>
-          <w:rFonts w:ascii="Consolas" w:hAnsi="Consolas"/>
-          <w:color w:val="0B3060"/>
-          <w:sz w:val="19"/>
-        </w:rPr>
-        <w:t>// and requireMethod(req, ...allowed) that throws 405.'</w:t>
-      </w:r>
-    </w:p>
-    <w:p>
-      <w:pPr>
-        <w:pStyle w:val="ListNumber"/>
-      </w:pPr>
-      <w:r>
-        <w:t>Audit the whole api/ folder for the one thing that reopens the door</w:t>
-      </w:r>
-    </w:p>
-    <w:p>
-      <w:r>
-        <w:rPr>
-          <w:rFonts w:ascii="Consolas" w:hAnsi="Consolas"/>
-          <w:color w:val="0B3060"/>
-          <w:sz w:val="19"/>
-        </w:rPr>
-        <w:t>grep -rn "sql(\`\|sql.unsafe" api/    # must return NOTHING — every query is a tagged template</w:t>
-      </w:r>
-    </w:p>
-    <w:p>
       <w:r>
         <w:rPr>
           <w:b/>
@@ -19449,7 +17588,7 @@
     </w:p>
     <w:p>
       <w:r>
-        <w:t>curl /api/courses returns all 20 Cook &amp; Bake courses as JSON with numeric ids and fees; ?category=Bakery returns 10; /api/courses/not-a-course returns a real 404; the injection payload returns a harmless 404 and the users table is still there; and grepping dist/ for 'postgresql://' returns nothing.</w:t>
+        <w:t>curl /api/courses returns all 20 Cook &amp; Bake courses as JSON with numeric ids and fees; ?category=Bakery returns 10; a POST returns 405; and grepping dist/ for 'postgresql://' returns nothing.</w:t>
       </w:r>
     </w:p>
     <w:p>
@@ -19473,17 +17612,17 @@
         <w:pStyle w:val="Heading2"/>
       </w:pPr>
       <w:r>
-        <w:t>Lab 5.2 — Fetch the Catalogue From React — Loading, Error and Success</w:t>
-      </w:r>
-    </w:p>
-    <w:p>
-      <w:r>
-        <w:t>Objective: consume your own API from React with all three states handled.</w:t>
-      </w:r>
-    </w:p>
-    <w:p>
-      <w:r>
-        <w:t>Goal: The API works; the app still renders a hardcoded array. The learner writes the src/lib/api.js fetch wrapper — including the check every AI forgets, response.ok, because fetch does NOT reject on a 404 — then replaces the array with the useCourses and useCourse hooks and renders loading, error and success for real.</w:t>
+        <w:t>Lab 5.2 — Parameterised SQL — Dynamic Routes and an Injection Probe</w:t>
+      </w:r>
+    </w:p>
+    <w:p>
+      <w:r>
+        <w:t>Objective: write dynamic API routes whose SQL cannot be injected.</w:t>
+      </w:r>
+    </w:p>
+    <w:p>
+      <w:r>
+        <w:t>Goal: Every course now needs its own URL. The learner adds the dynamic route api/courses/[slug].js, learns that Neon's sql`` tagged template sends the VALUE separately from the SQL, and then attacks their own API with a real injection payload to watch it bounce — before deliberately writing the unsafe version and seeing the difference.</w:t>
       </w:r>
     </w:p>
     <w:p>
@@ -19498,7 +17637,7 @@
     </w:p>
     <w:p>
       <w:r>
-        <w:t>src/lib/api.js and src/hooks/useCourses.js + useCourse.js — the catalogue now comes from Postgres   (Tech &amp; files: fetch, response.ok, HTTP status, useState + useEffect, skeleton and error UI.)</w:t>
+        <w:t>api/courses/[slug].js — one course by slug, a real 404 when there is none — and a security probe you run yourself   (Tech &amp; files: Vercel dynamic routes, tagged templates, parameterised queries, HTTP status codes.)</w:t>
       </w:r>
     </w:p>
     <w:p>
@@ -19516,56 +17655,245 @@
         <w:pStyle w:val="ListNumber"/>
       </w:pPr>
       <w:r>
-        <w:t>Write the wrapper — the browser's ONLY way to reach the server. Note what is NOT in it: no SQL, no password</w:t>
-      </w:r>
-    </w:p>
-    <w:p>
-      <w:r>
-        <w:rPr>
-          <w:rFonts w:ascii="Consolas" w:hAnsi="Consolas"/>
-          <w:color w:val="0B3060"/>
-          <w:sz w:val="19"/>
-        </w:rPr>
-        <w:t>const BASE = '/api'</w:t>
-      </w:r>
-    </w:p>
-    <w:p>
-      <w:r>
-        <w:rPr>
-          <w:rFonts w:ascii="Consolas" w:hAnsi="Consolas"/>
-          <w:color w:val="0B3060"/>
-          <w:sz w:val="19"/>
-        </w:rPr>
-      </w:r>
-    </w:p>
-    <w:p>
-      <w:r>
-        <w:rPr>
-          <w:rFonts w:ascii="Consolas" w:hAnsi="Consolas"/>
-          <w:color w:val="0B3060"/>
-          <w:sz w:val="19"/>
-        </w:rPr>
-        <w:t>async function request(method, path, body) {</w:t>
-      </w:r>
-    </w:p>
-    <w:p>
-      <w:r>
-        <w:rPr>
-          <w:rFonts w:ascii="Consolas" w:hAnsi="Consolas"/>
-          <w:color w:val="0B3060"/>
-          <w:sz w:val="19"/>
-        </w:rPr>
-        <w:t xml:space="preserve">  const res = await fetch(`${BASE}${path}`, { method, ... })</w:t>
-      </w:r>
-    </w:p>
-    <w:p>
-      <w:r>
-        <w:rPr>
-          <w:rFonts w:ascii="Consolas" w:hAnsi="Consolas"/>
-          <w:color w:val="0B3060"/>
-          <w:sz w:val="19"/>
-        </w:rPr>
-        <w:t xml:space="preserve">  ...</w:t>
+        <w:t>Add the dynamic route. The [slug] in the FILENAME is what makes it dynamic; Vercel hands you req.query.slug</w:t>
+      </w:r>
+    </w:p>
+    <w:p>
+      <w:r>
+        <w:rPr>
+          <w:rFonts w:ascii="Consolas" w:hAnsi="Consolas"/>
+          <w:color w:val="0B3060"/>
+          <w:sz w:val="19"/>
+        </w:rPr>
+        <w:t>// api/courses/[slug].js  -&gt;  GET /api/courses/artisan-sourdough-bread-baking</w:t>
+      </w:r>
+    </w:p>
+    <w:p>
+      <w:r>
+        <w:rPr>
+          <w:rFonts w:ascii="Consolas" w:hAnsi="Consolas"/>
+          <w:color w:val="0B3060"/>
+          <w:sz w:val="19"/>
+        </w:rPr>
+        <w:t>const { slug } = req.query ?? {}</w:t>
+      </w:r>
+    </w:p>
+    <w:p>
+      <w:pPr>
+        <w:pStyle w:val="ListNumber"/>
+      </w:pPr>
+      <w:r>
+        <w:t>Query with the tagged template — note there are NO parentheses. sql`...`, not sql("...")</w:t>
+      </w:r>
+    </w:p>
+    <w:p>
+      <w:r>
+        <w:rPr>
+          <w:rFonts w:ascii="Consolas" w:hAnsi="Consolas"/>
+          <w:color w:val="0B3060"/>
+          <w:sz w:val="19"/>
+        </w:rPr>
+        <w:t>const rows = await sql`</w:t>
+      </w:r>
+    </w:p>
+    <w:p>
+      <w:r>
+        <w:rPr>
+          <w:rFonts w:ascii="Consolas" w:hAnsi="Consolas"/>
+          <w:color w:val="0B3060"/>
+          <w:sz w:val="19"/>
+        </w:rPr>
+        <w:t xml:space="preserve">  select id::int as id, code, slug, title, category, level,</w:t>
+      </w:r>
+    </w:p>
+    <w:p>
+      <w:r>
+        <w:rPr>
+          <w:rFonts w:ascii="Consolas" w:hAnsi="Consolas"/>
+          <w:color w:val="0B3060"/>
+          <w:sz w:val="19"/>
+        </w:rPr>
+        <w:t xml:space="preserve">         fee::float8 as fee, weeks, campus, summary, emoji, image</w:t>
+      </w:r>
+    </w:p>
+    <w:p>
+      <w:r>
+        <w:rPr>
+          <w:rFonts w:ascii="Consolas" w:hAnsi="Consolas"/>
+          <w:color w:val="0B3060"/>
+          <w:sz w:val="19"/>
+        </w:rPr>
+        <w:t xml:space="preserve">  from courses</w:t>
+      </w:r>
+    </w:p>
+    <w:p>
+      <w:r>
+        <w:rPr>
+          <w:rFonts w:ascii="Consolas" w:hAnsi="Consolas"/>
+          <w:color w:val="0B3060"/>
+          <w:sz w:val="19"/>
+        </w:rPr>
+        <w:t xml:space="preserve">  where slug = ${slug}</w:t>
+      </w:r>
+    </w:p>
+    <w:p>
+      <w:r>
+        <w:rPr>
+          <w:rFonts w:ascii="Consolas" w:hAnsi="Consolas"/>
+          <w:color w:val="0B3060"/>
+          <w:sz w:val="19"/>
+        </w:rPr>
+        <w:t>`</w:t>
+      </w:r>
+    </w:p>
+    <w:p>
+      <w:pPr>
+        <w:pStyle w:val="ListNumber"/>
+      </w:pPr>
+      <w:r>
+        <w:t>Understand WHY that is safe. It looks like string interpolation and is not</w:t>
+      </w:r>
+    </w:p>
+    <w:p>
+      <w:r>
+        <w:rPr>
+          <w:rFonts w:ascii="Consolas" w:hAnsi="Consolas"/>
+          <w:color w:val="0B3060"/>
+          <w:sz w:val="19"/>
+        </w:rPr>
+        <w:t>// The driver sends the query TEXT and the VALUES to Postgres separately, as a</w:t>
+      </w:r>
+    </w:p>
+    <w:p>
+      <w:r>
+        <w:rPr>
+          <w:rFonts w:ascii="Consolas" w:hAnsi="Consolas"/>
+          <w:color w:val="0B3060"/>
+          <w:sz w:val="19"/>
+        </w:rPr>
+        <w:t>// parameterised query ($1). Postgres parses the SQL FIRST and only then binds</w:t>
+      </w:r>
+    </w:p>
+    <w:p>
+      <w:r>
+        <w:rPr>
+          <w:rFonts w:ascii="Consolas" w:hAnsi="Consolas"/>
+          <w:color w:val="0B3060"/>
+          <w:sz w:val="19"/>
+        </w:rPr>
+        <w:t>// the value. A value can therefore never become SQL. Injection is impossible.</w:t>
+      </w:r>
+    </w:p>
+    <w:p>
+      <w:pPr>
+        <w:pStyle w:val="ListNumber"/>
+      </w:pPr>
+      <w:r>
+        <w:t>PROBE IT. Attack your own API with a classic payload and watch it do nothing at all</w:t>
+      </w:r>
+    </w:p>
+    <w:p>
+      <w:r>
+        <w:rPr>
+          <w:rFonts w:ascii="Consolas" w:hAnsi="Consolas"/>
+          <w:color w:val="0B3060"/>
+          <w:sz w:val="19"/>
+        </w:rPr>
+        <w:t>curl "http://localhost:3000/api/courses/x'%20or%20'1'='1"</w:t>
+      </w:r>
+    </w:p>
+    <w:p>
+      <w:r>
+        <w:rPr>
+          <w:rFonts w:ascii="Consolas" w:hAnsi="Consolas"/>
+          <w:color w:val="0B3060"/>
+          <w:sz w:val="19"/>
+        </w:rPr>
+        <w:t># -&gt; 404 {"error":"No course found at /courses/x' or '1'='1."}</w:t>
+      </w:r>
+    </w:p>
+    <w:p>
+      <w:r>
+        <w:rPr>
+          <w:rFonts w:ascii="Consolas" w:hAnsi="Consolas"/>
+          <w:color w:val="0B3060"/>
+          <w:sz w:val="19"/>
+        </w:rPr>
+        <w:t># Postgres looked for a course whose slug is literally  x' or '1'='1  — and there isn't one.</w:t>
+      </w:r>
+    </w:p>
+    <w:p>
+      <w:pPr>
+        <w:pStyle w:val="ListNumber"/>
+      </w:pPr>
+      <w:r>
+        <w:t>Now write the version that is wrong, and see the difference in ONE line of code</w:t>
+      </w:r>
+    </w:p>
+    <w:p>
+      <w:r>
+        <w:rPr>
+          <w:rFonts w:ascii="Consolas" w:hAnsi="Consolas"/>
+          <w:color w:val="0B3060"/>
+          <w:sz w:val="19"/>
+        </w:rPr>
+        <w:t>// ⛔ NEVER. This builds a STRING, so the payload becomes part of the SQL:</w:t>
+      </w:r>
+    </w:p>
+    <w:p>
+      <w:r>
+        <w:rPr>
+          <w:rFonts w:ascii="Consolas" w:hAnsi="Consolas"/>
+          <w:color w:val="0B3060"/>
+          <w:sz w:val="19"/>
+        </w:rPr>
+        <w:t>// await sql(`select * from courses where slug = '${slug}'`)</w:t>
+      </w:r>
+    </w:p>
+    <w:p>
+      <w:r>
+        <w:rPr>
+          <w:rFonts w:ascii="Consolas" w:hAnsi="Consolas"/>
+          <w:color w:val="0B3060"/>
+          <w:sz w:val="19"/>
+        </w:rPr>
+        <w:t>//   slug = "x'; drop table users; --"   -&gt;  you no longer have a users table.</w:t>
+      </w:r>
+    </w:p>
+    <w:p>
+      <w:pPr>
+        <w:pStyle w:val="ListNumber"/>
+      </w:pPr>
+      <w:r>
+        <w:t>Delete the unsafe line. The rule: user input is always a ${} placeholder, never part of the query string</w:t>
+      </w:r>
+    </w:p>
+    <w:p>
+      <w:pPr>
+        <w:pStyle w:val="ListNumber"/>
+      </w:pPr>
+      <w:r>
+        <w:t>Return a real 404 when no row matches — the STATUS CODE is the API's answer, not a 200 with null</w:t>
+      </w:r>
+    </w:p>
+    <w:p>
+      <w:r>
+        <w:rPr>
+          <w:rFonts w:ascii="Consolas" w:hAnsi="Consolas"/>
+          <w:color w:val="0B3060"/>
+          <w:sz w:val="19"/>
+        </w:rPr>
+        <w:t>if (rows.length === 0) {</w:t>
+      </w:r>
+    </w:p>
+    <w:p>
+      <w:r>
+        <w:rPr>
+          <w:rFonts w:ascii="Consolas" w:hAnsi="Consolas"/>
+          <w:color w:val="0B3060"/>
+          <w:sz w:val="19"/>
+        </w:rPr>
+        <w:t xml:space="preserve">  throw new HttpError(404, `No course found at /courses/${slug}.`)</w:t>
       </w:r>
     </w:p>
     <w:p>
@@ -19583,67 +17911,47 @@
         <w:pStyle w:val="ListNumber"/>
       </w:pPr>
       <w:r>
-        <w:t>THE line AI-generated fetch code always omits: fetch does NOT reject on 404 or 500</w:t>
-      </w:r>
-    </w:p>
-    <w:p>
-      <w:r>
-        <w:rPr>
-          <w:rFonts w:ascii="Consolas" w:hAnsi="Consolas"/>
-          <w:color w:val="0B3060"/>
-          <w:sz w:val="19"/>
-        </w:rPr>
-        <w:t>if (!res.ok) {</w:t>
-      </w:r>
-    </w:p>
-    <w:p>
-      <w:r>
-        <w:rPr>
-          <w:rFonts w:ascii="Consolas" w:hAnsi="Consolas"/>
-          <w:color w:val="0B3060"/>
-          <w:sz w:val="19"/>
-        </w:rPr>
-        <w:t xml:space="preserve">  const err = new Error(data?.error ?? `Request failed (${res.status})`)</w:t>
-      </w:r>
-    </w:p>
-    <w:p>
-      <w:r>
-        <w:rPr>
-          <w:rFonts w:ascii="Consolas" w:hAnsi="Consolas"/>
-          <w:color w:val="0B3060"/>
-          <w:sz w:val="19"/>
-        </w:rPr>
-        <w:t xml:space="preserve">  err.status = res.status   // carry the status so the caller can tell 404 from 500</w:t>
-      </w:r>
-    </w:p>
-    <w:p>
-      <w:r>
-        <w:rPr>
-          <w:rFonts w:ascii="Consolas" w:hAnsi="Consolas"/>
-          <w:color w:val="0B3060"/>
-          <w:sz w:val="19"/>
-        </w:rPr>
-        <w:t xml:space="preserve">  throw err</w:t>
-      </w:r>
-    </w:p>
-    <w:p>
-      <w:r>
-        <w:rPr>
-          <w:rFonts w:ascii="Consolas" w:hAnsi="Consolas"/>
-          <w:color w:val="0B3060"/>
-          <w:sz w:val="19"/>
-        </w:rPr>
-        <w:t>}</w:t>
-      </w:r>
-    </w:p>
-    <w:p>
-      <w:r>
-        <w:rPr>
-          <w:rFonts w:ascii="Consolas" w:hAnsi="Consolas"/>
-          <w:color w:val="0B3060"/>
-          <w:sz w:val="19"/>
-        </w:rPr>
-        <w:t>// Without this, an error payload {error: "..."} sails into the UI and is rendered as a course.</w:t>
+        <w:t>Prompt the agent for the shared error plumbing so every route answers the same way</w:t>
+      </w:r>
+    </w:p>
+    <w:p>
+      <w:r>
+        <w:rPr>
+          <w:rFonts w:ascii="Consolas" w:hAnsi="Consolas"/>
+          <w:color w:val="0B3060"/>
+          <w:sz w:val="19"/>
+        </w:rPr>
+        <w:t>// Vibe prompt: 'In api/_lib/auth.js add an HttpError class (status + message),</w:t>
+      </w:r>
+    </w:p>
+    <w:p>
+      <w:r>
+        <w:rPr>
+          <w:rFonts w:ascii="Consolas" w:hAnsi="Consolas"/>
+          <w:color w:val="0B3060"/>
+          <w:sz w:val="19"/>
+        </w:rPr>
+        <w:t>// a sendError(res, err) that maps HttpError to its status and ANY other error to</w:t>
+      </w:r>
+    </w:p>
+    <w:p>
+      <w:r>
+        <w:rPr>
+          <w:rFonts w:ascii="Consolas" w:hAnsi="Consolas"/>
+          <w:color w:val="0B3060"/>
+          <w:sz w:val="19"/>
+        </w:rPr>
+        <w:t>// a generic 500 (never leak a stack trace or a SQL error naming our columns),</w:t>
+      </w:r>
+    </w:p>
+    <w:p>
+      <w:r>
+        <w:rPr>
+          <w:rFonts w:ascii="Consolas" w:hAnsi="Consolas"/>
+          <w:color w:val="0B3060"/>
+          <w:sz w:val="19"/>
+        </w:rPr>
+        <w:t>// and requireMethod(req, ...allowed) that throws 405.'</w:t>
       </w:r>
     </w:p>
     <w:p>
@@ -19651,293 +17959,17 @@
         <w:pStyle w:val="ListNumber"/>
       </w:pPr>
       <w:r>
-        <w:t>Prompt for the hook, and name all three states in the prompt so the agent cannot skip one</w:t>
-      </w:r>
-    </w:p>
-    <w:p>
-      <w:r>
-        <w:rPr>
-          <w:rFonts w:ascii="Consolas" w:hAnsi="Consolas"/>
-          <w:color w:val="0B3060"/>
-          <w:sz w:val="19"/>
-        </w:rPr>
-        <w:t>// Vibe prompt: 'Write src/hooks/useCourses.js. Load GET /api/courses through</w:t>
-      </w:r>
-    </w:p>
-    <w:p>
-      <w:r>
-        <w:rPr>
-          <w:rFonts w:ascii="Consolas" w:hAnsi="Consolas"/>
-          <w:color w:val="0B3060"/>
-          <w:sz w:val="19"/>
-        </w:rPr>
-        <w:t>// src/lib/api.js inside a useEffect. Return { courses, loading, error }. Clear</w:t>
-      </w:r>
-    </w:p>
-    <w:p>
-      <w:r>
-        <w:rPr>
-          <w:rFonts w:ascii="Consolas" w:hAnsi="Consolas"/>
-          <w:color w:val="0B3060"/>
-          <w:sz w:val="19"/>
-        </w:rPr>
-        <w:t>// loading in a finally so a failed request does not leave the skeleton forever.</w:t>
-      </w:r>
-    </w:p>
-    <w:p>
-      <w:r>
-        <w:rPr>
-          <w:rFonts w:ascii="Consolas" w:hAnsi="Consolas"/>
-          <w:color w:val="0B3060"/>
-          <w:sz w:val="19"/>
-        </w:rPr>
-        <w:t>// Guard against setting state after unmount with an `active` flag in the cleanup.'</w:t>
-      </w:r>
-    </w:p>
-    <w:p>
-      <w:pPr>
-        <w:pStyle w:val="ListNumber"/>
-      </w:pPr>
-      <w:r>
-        <w:t>Read the result against the three states — loading, error, success. Miss one and the UI feels broken</w:t>
-      </w:r>
-    </w:p>
-    <w:p>
-      <w:r>
-        <w:rPr>
-          <w:rFonts w:ascii="Consolas" w:hAnsi="Consolas"/>
-          <w:color w:val="0B3060"/>
-          <w:sz w:val="19"/>
-        </w:rPr>
-        <w:t>const [courses, setCourses] = useState([])</w:t>
-      </w:r>
-    </w:p>
-    <w:p>
-      <w:r>
-        <w:rPr>
-          <w:rFonts w:ascii="Consolas" w:hAnsi="Consolas"/>
-          <w:color w:val="0B3060"/>
-          <w:sz w:val="19"/>
-        </w:rPr>
-        <w:t>const [loading, setLoading] = useState(true)</w:t>
-      </w:r>
-    </w:p>
-    <w:p>
-      <w:r>
-        <w:rPr>
-          <w:rFonts w:ascii="Consolas" w:hAnsi="Consolas"/>
-          <w:color w:val="0B3060"/>
-          <w:sz w:val="19"/>
-        </w:rPr>
-        <w:t>const [error, setError] = useState(null)</w:t>
-      </w:r>
-    </w:p>
-    <w:p>
-      <w:pPr>
-        <w:pStyle w:val="ListNumber"/>
-      </w:pPr>
-      <w:r>
-        <w:t>Check the finally and the cleanup — the two things a generated hook usually lacks</w:t>
-      </w:r>
-    </w:p>
-    <w:p>
-      <w:r>
-        <w:rPr>
-          <w:rFonts w:ascii="Consolas" w:hAnsi="Consolas"/>
-          <w:color w:val="0B3060"/>
-          <w:sz w:val="19"/>
-        </w:rPr>
-        <w:t>} finally {</w:t>
-      </w:r>
-    </w:p>
-    <w:p>
-      <w:r>
-        <w:rPr>
-          <w:rFonts w:ascii="Consolas" w:hAnsi="Consolas"/>
-          <w:color w:val="0B3060"/>
-          <w:sz w:val="19"/>
-        </w:rPr>
-        <w:t xml:space="preserve">  if (active) setLoading(false)   // no finally = a stuck skeleton forever</w:t>
-      </w:r>
-    </w:p>
-    <w:p>
-      <w:r>
-        <w:rPr>
-          <w:rFonts w:ascii="Consolas" w:hAnsi="Consolas"/>
-          <w:color w:val="0B3060"/>
-          <w:sz w:val="19"/>
-        </w:rPr>
-        <w:t>}</w:t>
-      </w:r>
-    </w:p>
-    <w:p>
-      <w:r>
-        <w:rPr>
-          <w:rFonts w:ascii="Consolas" w:hAnsi="Consolas"/>
-          <w:color w:val="0B3060"/>
-          <w:sz w:val="19"/>
-        </w:rPr>
-        <w:t>return () =&gt; { active = false }    // no guard = setState on an unmounted component</w:t>
-      </w:r>
-    </w:p>
-    <w:p>
-      <w:pPr>
-        <w:pStyle w:val="ListNumber"/>
-      </w:pPr>
-      <w:r>
-        <w:t>Render all three in CoursesPage and HomePage — skeletons, a red error line, then the grid</w:t>
-      </w:r>
-    </w:p>
-    <w:p>
-      <w:r>
-        <w:rPr>
-          <w:rFonts w:ascii="Consolas" w:hAnsi="Consolas"/>
-          <w:color w:val="0B3060"/>
-          <w:sz w:val="19"/>
-        </w:rPr>
-        <w:t>{loading &amp;&amp; &lt;div className="grid"&gt;{[1,2,3,4,5,6].map(n =&gt; &lt;div key={n} className="skeleton" /&gt;)}&lt;/div&gt;}</w:t>
-      </w:r>
-    </w:p>
-    <w:p>
-      <w:r>
-        <w:rPr>
-          <w:rFonts w:ascii="Consolas" w:hAnsi="Consolas"/>
-          <w:color w:val="0B3060"/>
-          <w:sz w:val="19"/>
-        </w:rPr>
-        <w:t>{error &amp;&amp; &lt;p className="error"&gt;{error}&lt;/p&gt;}</w:t>
-      </w:r>
-    </w:p>
-    <w:p>
-      <w:r>
-        <w:rPr>
-          <w:rFonts w:ascii="Consolas" w:hAnsi="Consolas"/>
-          <w:color w:val="0B3060"/>
-          <w:sz w:val="19"/>
-        </w:rPr>
-        <w:t>{!loading &amp;&amp; !error &amp;&amp; &lt;CourseGrid courses={visible} /&gt;}</w:t>
-      </w:r>
-    </w:p>
-    <w:p>
-      <w:pPr>
-        <w:pStyle w:val="ListNumber"/>
-      </w:pPr>
-      <w:r>
-        <w:t>Write useCourse(slug) and make it distinguish the two failures — a 404 is NOT a crash</w:t>
-      </w:r>
-    </w:p>
-    <w:p>
-      <w:r>
-        <w:rPr>
-          <w:rFonts w:ascii="Consolas" w:hAnsi="Consolas"/>
-          <w:color w:val="0B3060"/>
-          <w:sz w:val="19"/>
-        </w:rPr>
-        <w:t>if (err.status === 404) {</w:t>
-      </w:r>
-    </w:p>
-    <w:p>
-      <w:r>
-        <w:rPr>
-          <w:rFonts w:ascii="Consolas" w:hAnsi="Consolas"/>
-          <w:color w:val="0B3060"/>
-          <w:sz w:val="19"/>
-        </w:rPr>
-        <w:t xml:space="preserve">  setCourse(null)   // -&gt; the 'Course not found' page</w:t>
-      </w:r>
-    </w:p>
-    <w:p>
-      <w:r>
-        <w:rPr>
-          <w:rFonts w:ascii="Consolas" w:hAnsi="Consolas"/>
-          <w:color w:val="0B3060"/>
-          <w:sz w:val="19"/>
-        </w:rPr>
-        <w:t xml:space="preserve">  setError(null)</w:t>
-      </w:r>
-    </w:p>
-    <w:p>
-      <w:r>
-        <w:rPr>
-          <w:rFonts w:ascii="Consolas" w:hAnsi="Consolas"/>
-          <w:color w:val="0B3060"/>
-          <w:sz w:val="19"/>
-        </w:rPr>
-        <w:t>} else {</w:t>
-      </w:r>
-    </w:p>
-    <w:p>
-      <w:r>
-        <w:rPr>
-          <w:rFonts w:ascii="Consolas" w:hAnsi="Consolas"/>
-          <w:color w:val="0B3060"/>
-          <w:sz w:val="19"/>
-        </w:rPr>
-        <w:t xml:space="preserve">  setError(err.message)   // -&gt; the red 'Something went wrong'</w:t>
-      </w:r>
-    </w:p>
-    <w:p>
-      <w:r>
-        <w:rPr>
-          <w:rFonts w:ascii="Consolas" w:hAnsi="Consolas"/>
-          <w:color w:val="0B3060"/>
-          <w:sz w:val="19"/>
-        </w:rPr>
-        <w:t>}</w:t>
-      </w:r>
-    </w:p>
-    <w:p>
-      <w:pPr>
-        <w:pStyle w:val="ListNumber"/>
-      </w:pPr>
-      <w:r>
-        <w:t>Delete the import of src/data/courses.js from the pages. The catalogue is now Postgres</w:t>
-      </w:r>
-    </w:p>
-    <w:p>
-      <w:pPr>
-        <w:pStyle w:val="ListNumber"/>
-      </w:pPr>
-      <w:r>
-        <w:t>Prove it end to end: change a fee in the Neon table editor and refresh the browser</w:t>
-      </w:r>
-    </w:p>
-    <w:p>
-      <w:r>
-        <w:rPr>
-          <w:rFonts w:ascii="Consolas" w:hAnsi="Consolas"/>
-          <w:color w:val="0B3060"/>
-          <w:sz w:val="19"/>
-        </w:rPr>
-        <w:t>update courses set fee = 720 where code = 'BAK-101';</w:t>
-      </w:r>
-    </w:p>
-    <w:p>
-      <w:pPr>
-        <w:pStyle w:val="ListNumber"/>
-      </w:pPr>
-      <w:r>
-        <w:t>Test the error branch on purpose — throttle the network, then point BASE at a bad path</w:t>
-      </w:r>
-    </w:p>
-    <w:p>
-      <w:r>
-        <w:rPr>
-          <w:rFonts w:ascii="Consolas" w:hAnsi="Consolas"/>
-          <w:color w:val="0B3060"/>
-          <w:sz w:val="19"/>
-        </w:rPr>
-        <w:t>// DevTools -&gt; Network -&gt; Slow 3G  (see the skeletons)</w:t>
-      </w:r>
-    </w:p>
-    <w:p>
-      <w:r>
-        <w:rPr>
-          <w:rFonts w:ascii="Consolas" w:hAnsi="Consolas"/>
-          <w:color w:val="0B3060"/>
-          <w:sz w:val="19"/>
-        </w:rPr>
-        <w:t>// const BASE = '/apix'                (see the error line, not a blank page)</w:t>
+        <w:t>Audit the whole api/ folder for the one thing that reopens the door</w:t>
+      </w:r>
+    </w:p>
+    <w:p>
+      <w:r>
+        <w:rPr>
+          <w:rFonts w:ascii="Consolas" w:hAnsi="Consolas"/>
+          <w:color w:val="0B3060"/>
+          <w:sz w:val="19"/>
+        </w:rPr>
+        <w:t>grep -rn "sql(\`\|sql.unsafe" api/    # must return NOTHING — every query is a tagged template</w:t>
       </w:r>
     </w:p>
     <w:p>
@@ -19952,7 +17984,7 @@
     </w:p>
     <w:p>
       <w:r>
-        <w:t>The catalogue renders from Postgres after a skeleton; editing a fee in Neon changes the page on refresh; /courses/not-a-course shows 'Course not found' (not a red error); and breaking the API base URL shows the error message instead of an endless skeleton.</w:t>
+        <w:t>GET /api/courses/artisan-sourdough-bread-baking returns one course; GET /api/courses/not-a-course returns 404 with a clear message; the injection payload returns a harmless 404 and the users table is still there; and grep finds no string-built SQL anywhere in api/.</w:t>
       </w:r>
     </w:p>
     <w:p>
@@ -19976,17 +18008,17 @@
         <w:pStyle w:val="Heading2"/>
       </w:pPr>
       <w:r>
-        <w:t>Lab 5.3 — Accounts — Password Hashing with bcrypt, Sessions with JWT</w:t>
-      </w:r>
-    </w:p>
-    <w:p>
-      <w:r>
-        <w:t>Objective: hash passwords with bcrypt, issue and verify JWTs, and restore the session on refresh.</w:t>
-      </w:r>
-    </w:p>
-    <w:p>
-      <w:r>
-        <w:t>Goal: Students must be able to sign up and sign in. The learner builds api/auth/signup, login and me with bcrypt hashing and JWT signing, writes requireAuth — the single source of identity for the whole API — and adds the AuthContext that stores the token, sends it on every request and restores the session on boot.</w:t>
+        <w:t>Lab 5.3 — Calling the API from React — Loading, Error and Success</w:t>
+      </w:r>
+    </w:p>
+    <w:p>
+      <w:r>
+        <w:t>Objective: consume your own API from React with all three states handled.</w:t>
+      </w:r>
+    </w:p>
+    <w:p>
+      <w:r>
+        <w:t>Goal: The API works; the app still renders a hardcoded array. The learner writes the src/lib/api.js fetch wrapper — including the check every AI forgets, response.ok, because fetch does NOT reject on a 404 — then replaces the array with the useCourses and useCourse hooks and renders loading, error and success for real.</w:t>
       </w:r>
     </w:p>
     <w:p>
@@ -20001,7 +18033,7 @@
     </w:p>
     <w:p>
       <w:r>
-        <w:t>api/auth/signup.js, login.js, me.js, api/_lib/auth.js and src/context/AuthContext.jsx   (Tech &amp; files: bcryptjs, jsonwebtoken, JWT_SECRET, Authorization: Bearer.)</w:t>
+        <w:t>src/lib/api.js and src/hooks/useCourses.js + useCourse.js — the catalogue now comes from Postgres   (Tech &amp; files: fetch, response.ok, HTTP status, useState + useEffect, skeleton and error UI.)</w:t>
       </w:r>
     </w:p>
     <w:p>
@@ -20019,27 +18051,66 @@
         <w:pStyle w:val="ListNumber"/>
       </w:pPr>
       <w:r>
-        <w:t>Add the second server-side secret — again, NO VITE_ prefix. Anyone holding it can mint a token for any user</w:t>
-      </w:r>
-    </w:p>
-    <w:p>
-      <w:r>
-        <w:rPr>
-          <w:rFonts w:ascii="Consolas" w:hAnsi="Consolas"/>
-          <w:color w:val="0B3060"/>
-          <w:sz w:val="19"/>
-        </w:rPr>
-        <w:t>JWT_SECRET=$(node -e "console.log(require('crypto').randomBytes(32).toString('hex'))")</w:t>
-      </w:r>
-    </w:p>
-    <w:p>
-      <w:r>
-        <w:rPr>
-          <w:rFonts w:ascii="Consolas" w:hAnsi="Consolas"/>
-          <w:color w:val="0B3060"/>
-          <w:sz w:val="19"/>
-        </w:rPr>
-        <w:t>npm install bcryptjs jsonwebtoken</w:t>
+        <w:t>Write the wrapper — the browser's ONLY way to reach the server. Note what is NOT in it: no SQL, no password</w:t>
+      </w:r>
+    </w:p>
+    <w:p>
+      <w:r>
+        <w:rPr>
+          <w:rFonts w:ascii="Consolas" w:hAnsi="Consolas"/>
+          <w:color w:val="0B3060"/>
+          <w:sz w:val="19"/>
+        </w:rPr>
+        <w:t>const BASE = '/api'</w:t>
+      </w:r>
+    </w:p>
+    <w:p>
+      <w:r>
+        <w:rPr>
+          <w:rFonts w:ascii="Consolas" w:hAnsi="Consolas"/>
+          <w:color w:val="0B3060"/>
+          <w:sz w:val="19"/>
+        </w:rPr>
+      </w:r>
+    </w:p>
+    <w:p>
+      <w:r>
+        <w:rPr>
+          <w:rFonts w:ascii="Consolas" w:hAnsi="Consolas"/>
+          <w:color w:val="0B3060"/>
+          <w:sz w:val="19"/>
+        </w:rPr>
+        <w:t>async function request(method, path, body) {</w:t>
+      </w:r>
+    </w:p>
+    <w:p>
+      <w:r>
+        <w:rPr>
+          <w:rFonts w:ascii="Consolas" w:hAnsi="Consolas"/>
+          <w:color w:val="0B3060"/>
+          <w:sz w:val="19"/>
+        </w:rPr>
+        <w:t xml:space="preserve">  const res = await fetch(`${BASE}${path}`, { method, ... })</w:t>
+      </w:r>
+    </w:p>
+    <w:p>
+      <w:r>
+        <w:rPr>
+          <w:rFonts w:ascii="Consolas" w:hAnsi="Consolas"/>
+          <w:color w:val="0B3060"/>
+          <w:sz w:val="19"/>
+        </w:rPr>
+        <w:t xml:space="preserve">  ...</w:t>
+      </w:r>
+    </w:p>
+    <w:p>
+      <w:r>
+        <w:rPr>
+          <w:rFonts w:ascii="Consolas" w:hAnsi="Consolas"/>
+          <w:color w:val="0B3060"/>
+          <w:sz w:val="19"/>
+        </w:rPr>
+        <w:t>}</w:t>
       </w:r>
     </w:p>
     <w:p>
@@ -20047,27 +18118,67 @@
         <w:pStyle w:val="ListNumber"/>
       </w:pPr>
       <w:r>
-        <w:t>NEVER store the password. bcrypt is a deliberately slow, salted, one-way hash</w:t>
-      </w:r>
-    </w:p>
-    <w:p>
-      <w:r>
-        <w:rPr>
-          <w:rFonts w:ascii="Consolas" w:hAnsi="Consolas"/>
-          <w:color w:val="0B3060"/>
-          <w:sz w:val="19"/>
-        </w:rPr>
-        <w:t>const passwordHash = await bcrypt.hash(password, 10)   // ~100ms by design: brute force is expensive</w:t>
-      </w:r>
-    </w:p>
-    <w:p>
-      <w:r>
-        <w:rPr>
-          <w:rFonts w:ascii="Consolas" w:hAnsi="Consolas"/>
-          <w:color w:val="0B3060"/>
-          <w:sz w:val="19"/>
-        </w:rPr>
-        <w:t>// bcrypt salts every hash, so two users with the same password get different hashes.</w:t>
+        <w:t>THE line AI-generated fetch code always omits: fetch does NOT reject on 404 or 500</w:t>
+      </w:r>
+    </w:p>
+    <w:p>
+      <w:r>
+        <w:rPr>
+          <w:rFonts w:ascii="Consolas" w:hAnsi="Consolas"/>
+          <w:color w:val="0B3060"/>
+          <w:sz w:val="19"/>
+        </w:rPr>
+        <w:t>if (!res.ok) {</w:t>
+      </w:r>
+    </w:p>
+    <w:p>
+      <w:r>
+        <w:rPr>
+          <w:rFonts w:ascii="Consolas" w:hAnsi="Consolas"/>
+          <w:color w:val="0B3060"/>
+          <w:sz w:val="19"/>
+        </w:rPr>
+        <w:t xml:space="preserve">  const err = new Error(data?.error ?? `Request failed (${res.status})`)</w:t>
+      </w:r>
+    </w:p>
+    <w:p>
+      <w:r>
+        <w:rPr>
+          <w:rFonts w:ascii="Consolas" w:hAnsi="Consolas"/>
+          <w:color w:val="0B3060"/>
+          <w:sz w:val="19"/>
+        </w:rPr>
+        <w:t xml:space="preserve">  err.status = res.status   // carry the status so the caller can tell 404 from 500</w:t>
+      </w:r>
+    </w:p>
+    <w:p>
+      <w:r>
+        <w:rPr>
+          <w:rFonts w:ascii="Consolas" w:hAnsi="Consolas"/>
+          <w:color w:val="0B3060"/>
+          <w:sz w:val="19"/>
+        </w:rPr>
+        <w:t xml:space="preserve">  throw err</w:t>
+      </w:r>
+    </w:p>
+    <w:p>
+      <w:r>
+        <w:rPr>
+          <w:rFonts w:ascii="Consolas" w:hAnsi="Consolas"/>
+          <w:color w:val="0B3060"/>
+          <w:sz w:val="19"/>
+        </w:rPr>
+        <w:t>}</w:t>
+      </w:r>
+    </w:p>
+    <w:p>
+      <w:r>
+        <w:rPr>
+          <w:rFonts w:ascii="Consolas" w:hAnsi="Consolas"/>
+          <w:color w:val="0B3060"/>
+          <w:sz w:val="19"/>
+        </w:rPr>
+        <w:t>// Without this, an error payload {error: "..."} sails into the UI and is rendered as a course.</w:t>
       </w:r>
     </w:p>
     <w:p>
@@ -20075,77 +18186,47 @@
         <w:pStyle w:val="ListNumber"/>
       </w:pPr>
       <w:r>
-        <w:t>Insert the user and look hard at the RETURNING list — password_hash is NOT in it, and never will be</w:t>
-      </w:r>
-    </w:p>
-    <w:p>
-      <w:r>
-        <w:rPr>
-          <w:rFonts w:ascii="Consolas" w:hAnsi="Consolas"/>
-          <w:color w:val="0B3060"/>
-          <w:sz w:val="19"/>
-        </w:rPr>
-        <w:t>const rows = await sql`</w:t>
-      </w:r>
-    </w:p>
-    <w:p>
-      <w:r>
-        <w:rPr>
-          <w:rFonts w:ascii="Consolas" w:hAnsi="Consolas"/>
-          <w:color w:val="0B3060"/>
-          <w:sz w:val="19"/>
-        </w:rPr>
-        <w:t xml:space="preserve">  insert into users (email, name, password_hash)</w:t>
-      </w:r>
-    </w:p>
-    <w:p>
-      <w:r>
-        <w:rPr>
-          <w:rFonts w:ascii="Consolas" w:hAnsi="Consolas"/>
-          <w:color w:val="0B3060"/>
-          <w:sz w:val="19"/>
-        </w:rPr>
-        <w:t xml:space="preserve">  values (${email.trim().toLowerCase()}, ${name}, ${passwordHash})</w:t>
-      </w:r>
-    </w:p>
-    <w:p>
-      <w:r>
-        <w:rPr>
-          <w:rFonts w:ascii="Consolas" w:hAnsi="Consolas"/>
-          <w:color w:val="0B3060"/>
-          <w:sz w:val="19"/>
-        </w:rPr>
-        <w:t xml:space="preserve">  on conflict (email) do nothing</w:t>
-      </w:r>
-    </w:p>
-    <w:p>
-      <w:r>
-        <w:rPr>
-          <w:rFonts w:ascii="Consolas" w:hAnsi="Consolas"/>
-          <w:color w:val="0B3060"/>
-          <w:sz w:val="19"/>
-        </w:rPr>
-        <w:t xml:space="preserve">  returning id::int as id, email, name, created_at</w:t>
-      </w:r>
-    </w:p>
-    <w:p>
-      <w:r>
-        <w:rPr>
-          <w:rFonts w:ascii="Consolas" w:hAnsi="Consolas"/>
-          <w:color w:val="0B3060"/>
-          <w:sz w:val="19"/>
-        </w:rPr>
-        <w:t>`</w:t>
-      </w:r>
-    </w:p>
-    <w:p>
-      <w:r>
-        <w:rPr>
-          <w:rFonts w:ascii="Consolas" w:hAnsi="Consolas"/>
-          <w:color w:val="0B3060"/>
-          <w:sz w:val="19"/>
-        </w:rPr>
-        <w:t>// zero rows = the email is taken -&gt; 409. The hash never leaves this function.</w:t>
+        <w:t>Prompt for the hook, and name all three states in the prompt so the agent cannot skip one</w:t>
+      </w:r>
+    </w:p>
+    <w:p>
+      <w:r>
+        <w:rPr>
+          <w:rFonts w:ascii="Consolas" w:hAnsi="Consolas"/>
+          <w:color w:val="0B3060"/>
+          <w:sz w:val="19"/>
+        </w:rPr>
+        <w:t>// Vibe prompt: 'Write src/hooks/useCourses.js. Load GET /api/courses through</w:t>
+      </w:r>
+    </w:p>
+    <w:p>
+      <w:r>
+        <w:rPr>
+          <w:rFonts w:ascii="Consolas" w:hAnsi="Consolas"/>
+          <w:color w:val="0B3060"/>
+          <w:sz w:val="19"/>
+        </w:rPr>
+        <w:t>// src/lib/api.js inside a useEffect. Return { courses, loading, error }. Clear</w:t>
+      </w:r>
+    </w:p>
+    <w:p>
+      <w:r>
+        <w:rPr>
+          <w:rFonts w:ascii="Consolas" w:hAnsi="Consolas"/>
+          <w:color w:val="0B3060"/>
+          <w:sz w:val="19"/>
+        </w:rPr>
+        <w:t>// loading in a finally so a failed request does not leave the skeleton forever.</w:t>
+      </w:r>
+    </w:p>
+    <w:p>
+      <w:r>
+        <w:rPr>
+          <w:rFonts w:ascii="Consolas" w:hAnsi="Consolas"/>
+          <w:color w:val="0B3060"/>
+          <w:sz w:val="19"/>
+        </w:rPr>
+        <w:t>// Guard against setting state after unmount with an `active` flag in the cleanup.'</w:t>
       </w:r>
     </w:p>
     <w:p>
@@ -20153,47 +18234,37 @@
         <w:pStyle w:val="ListNumber"/>
       </w:pPr>
       <w:r>
-        <w:t>Log in with bcrypt.compare — never re-hash and compare with ===, and give ONE message for both failures</w:t>
-      </w:r>
-    </w:p>
-    <w:p>
-      <w:r>
-        <w:rPr>
-          <w:rFonts w:ascii="Consolas" w:hAnsi="Consolas"/>
-          <w:color w:val="0B3060"/>
-          <w:sz w:val="19"/>
-        </w:rPr>
-        <w:t>const ok = user ? await bcrypt.compare(password, user.password_hash) : false</w:t>
-      </w:r>
-    </w:p>
-    <w:p>
-      <w:r>
-        <w:rPr>
-          <w:rFonts w:ascii="Consolas" w:hAnsi="Consolas"/>
-          <w:color w:val="0B3060"/>
-          <w:sz w:val="19"/>
-        </w:rPr>
-        <w:t>if (!ok) throw new HttpError(401, 'Invalid email or password.')</w:t>
-      </w:r>
-    </w:p>
-    <w:p>
-      <w:r>
-        <w:rPr>
-          <w:rFonts w:ascii="Consolas" w:hAnsi="Consolas"/>
-          <w:color w:val="0B3060"/>
-          <w:sz w:val="19"/>
-        </w:rPr>
-        <w:t>// Separate messages for 'no such email' and 'wrong password' hand an attacker a</w:t>
-      </w:r>
-    </w:p>
-    <w:p>
-      <w:r>
-        <w:rPr>
-          <w:rFonts w:ascii="Consolas" w:hAnsi="Consolas"/>
-          <w:color w:val="0B3060"/>
-          <w:sz w:val="19"/>
-        </w:rPr>
-        <w:t>// free tool for discovering which emails have accounts.</w:t>
+        <w:t>Read the result against the three states — loading, error, success. Miss one and the UI feels broken</w:t>
+      </w:r>
+    </w:p>
+    <w:p>
+      <w:r>
+        <w:rPr>
+          <w:rFonts w:ascii="Consolas" w:hAnsi="Consolas"/>
+          <w:color w:val="0B3060"/>
+          <w:sz w:val="19"/>
+        </w:rPr>
+        <w:t>const [courses, setCourses] = useState([])</w:t>
+      </w:r>
+    </w:p>
+    <w:p>
+      <w:r>
+        <w:rPr>
+          <w:rFonts w:ascii="Consolas" w:hAnsi="Consolas"/>
+          <w:color w:val="0B3060"/>
+          <w:sz w:val="19"/>
+        </w:rPr>
+        <w:t>const [loading, setLoading] = useState(true)</w:t>
+      </w:r>
+    </w:p>
+    <w:p>
+      <w:r>
+        <w:rPr>
+          <w:rFonts w:ascii="Consolas" w:hAnsi="Consolas"/>
+          <w:color w:val="0B3060"/>
+          <w:sz w:val="19"/>
+        </w:rPr>
+        <w:t>const [error, setError] = useState(null)</w:t>
       </w:r>
     </w:p>
     <w:p>
@@ -20201,37 +18272,27 @@
         <w:pStyle w:val="ListNumber"/>
       </w:pPr>
       <w:r>
-        <w:t>Sign a JWT. The payload is base64, NOT encrypted — anyone can read it, so put no secret in it</w:t>
-      </w:r>
-    </w:p>
-    <w:p>
-      <w:r>
-        <w:rPr>
-          <w:rFonts w:ascii="Consolas" w:hAnsi="Consolas"/>
-          <w:color w:val="0B3060"/>
-          <w:sz w:val="19"/>
-        </w:rPr>
-        <w:t>export function signToken(user) {</w:t>
-      </w:r>
-    </w:p>
-    <w:p>
-      <w:r>
-        <w:rPr>
-          <w:rFonts w:ascii="Consolas" w:hAnsi="Consolas"/>
-          <w:color w:val="0B3060"/>
-          <w:sz w:val="19"/>
-        </w:rPr>
-        <w:t xml:space="preserve">  return jwt.sign({ sub: String(user.id), email: user.email, name: user.name },</w:t>
-      </w:r>
-    </w:p>
-    <w:p>
-      <w:r>
-        <w:rPr>
-          <w:rFonts w:ascii="Consolas" w:hAnsi="Consolas"/>
-          <w:color w:val="0B3060"/>
-          <w:sz w:val="19"/>
-        </w:rPr>
-        <w:t xml:space="preserve">                  JWT_SECRET, { expiresIn: '7d' })</w:t>
+        <w:t>Check the finally and the cleanup — the two things a generated hook usually lacks</w:t>
+      </w:r>
+    </w:p>
+    <w:p>
+      <w:r>
+        <w:rPr>
+          <w:rFonts w:ascii="Consolas" w:hAnsi="Consolas"/>
+          <w:color w:val="0B3060"/>
+          <w:sz w:val="19"/>
+        </w:rPr>
+        <w:t>} finally {</w:t>
+      </w:r>
+    </w:p>
+    <w:p>
+      <w:r>
+        <w:rPr>
+          <w:rFonts w:ascii="Consolas" w:hAnsi="Consolas"/>
+          <w:color w:val="0B3060"/>
+          <w:sz w:val="19"/>
+        </w:rPr>
+        <w:t xml:space="preserve">  if (active) setLoading(false)   // no finally = a stuck skeleton forever</w:t>
       </w:r>
     </w:p>
     <w:p>
@@ -20251,17 +18312,7 @@
           <w:color w:val="0B3060"/>
           <w:sz w:val="19"/>
         </w:rPr>
-        <w:t>// What makes it trustworthy is the SIGNATURE. Edit one byte of the payload and</w:t>
-      </w:r>
-    </w:p>
-    <w:p>
-      <w:r>
-        <w:rPr>
-          <w:rFonts w:ascii="Consolas" w:hAnsi="Consolas"/>
-          <w:color w:val="0B3060"/>
-          <w:sz w:val="19"/>
-        </w:rPr>
-        <w:t>// verify() throws — which is why we may trust `sub` and must not trust req.body.</w:t>
+        <w:t>return () =&gt; { active = false }    // no guard = setState on an unmounted component</w:t>
       </w:r>
     </w:p>
     <w:p>
@@ -20269,57 +18320,95 @@
         <w:pStyle w:val="ListNumber"/>
       </w:pPr>
       <w:r>
-        <w:t>Write requireAuth — the single source of identity for the whole API</w:t>
-      </w:r>
-    </w:p>
-    <w:p>
-      <w:r>
-        <w:rPr>
-          <w:rFonts w:ascii="Consolas" w:hAnsi="Consolas"/>
-          <w:color w:val="0B3060"/>
-          <w:sz w:val="19"/>
-        </w:rPr>
-        <w:t>export function requireAuth(req) {</w:t>
-      </w:r>
-    </w:p>
-    <w:p>
-      <w:r>
-        <w:rPr>
-          <w:rFonts w:ascii="Consolas" w:hAnsi="Consolas"/>
-          <w:color w:val="0B3060"/>
-          <w:sz w:val="19"/>
-        </w:rPr>
-        <w:t xml:space="preserve">  const header = req.headers?.authorization ?? ''</w:t>
-      </w:r>
-    </w:p>
-    <w:p>
-      <w:r>
-        <w:rPr>
-          <w:rFonts w:ascii="Consolas" w:hAnsi="Consolas"/>
-          <w:color w:val="0B3060"/>
-          <w:sz w:val="19"/>
-        </w:rPr>
-        <w:t xml:space="preserve">  if (!header.startsWith('Bearer ')) throw new HttpError(401, 'Missing Authorization header.')</w:t>
-      </w:r>
-    </w:p>
-    <w:p>
-      <w:r>
-        <w:rPr>
-          <w:rFonts w:ascii="Consolas" w:hAnsi="Consolas"/>
-          <w:color w:val="0B3060"/>
-          <w:sz w:val="19"/>
-        </w:rPr>
-        <w:t xml:space="preserve">  const payload = jwt.verify(header.slice(7).trim(), JWT_SECRET)   // throws if tampered or expired</w:t>
-      </w:r>
-    </w:p>
-    <w:p>
-      <w:r>
-        <w:rPr>
-          <w:rFonts w:ascii="Consolas" w:hAnsi="Consolas"/>
-          <w:color w:val="0B3060"/>
-          <w:sz w:val="19"/>
-        </w:rPr>
-        <w:t xml:space="preserve">  return Number(payload.sub)   // the user's id — VERIFIED, not claimed</w:t>
+        <w:t>Render all three in CoursesPage and HomePage — skeletons, a red error line, then the grid</w:t>
+      </w:r>
+    </w:p>
+    <w:p>
+      <w:r>
+        <w:rPr>
+          <w:rFonts w:ascii="Consolas" w:hAnsi="Consolas"/>
+          <w:color w:val="0B3060"/>
+          <w:sz w:val="19"/>
+        </w:rPr>
+        <w:t>{loading &amp;&amp; &lt;div className="grid"&gt;{[1,2,3,4,5,6].map(n =&gt; &lt;div key={n} className="skeleton" /&gt;)}&lt;/div&gt;}</w:t>
+      </w:r>
+    </w:p>
+    <w:p>
+      <w:r>
+        <w:rPr>
+          <w:rFonts w:ascii="Consolas" w:hAnsi="Consolas"/>
+          <w:color w:val="0B3060"/>
+          <w:sz w:val="19"/>
+        </w:rPr>
+        <w:t>{error &amp;&amp; &lt;p className="error"&gt;{error}&lt;/p&gt;}</w:t>
+      </w:r>
+    </w:p>
+    <w:p>
+      <w:r>
+        <w:rPr>
+          <w:rFonts w:ascii="Consolas" w:hAnsi="Consolas"/>
+          <w:color w:val="0B3060"/>
+          <w:sz w:val="19"/>
+        </w:rPr>
+        <w:t>{!loading &amp;&amp; !error &amp;&amp; &lt;CourseGrid courses={visible} /&gt;}</w:t>
+      </w:r>
+    </w:p>
+    <w:p>
+      <w:pPr>
+        <w:pStyle w:val="ListNumber"/>
+      </w:pPr>
+      <w:r>
+        <w:t>Write useCourse(slug) and make it distinguish the two failures — a 404 is NOT a crash</w:t>
+      </w:r>
+    </w:p>
+    <w:p>
+      <w:r>
+        <w:rPr>
+          <w:rFonts w:ascii="Consolas" w:hAnsi="Consolas"/>
+          <w:color w:val="0B3060"/>
+          <w:sz w:val="19"/>
+        </w:rPr>
+        <w:t>if (err.status === 404) {</w:t>
+      </w:r>
+    </w:p>
+    <w:p>
+      <w:r>
+        <w:rPr>
+          <w:rFonts w:ascii="Consolas" w:hAnsi="Consolas"/>
+          <w:color w:val="0B3060"/>
+          <w:sz w:val="19"/>
+        </w:rPr>
+        <w:t xml:space="preserve">  setCourse(null)   // -&gt; the 'Course not found' page</w:t>
+      </w:r>
+    </w:p>
+    <w:p>
+      <w:r>
+        <w:rPr>
+          <w:rFonts w:ascii="Consolas" w:hAnsi="Consolas"/>
+          <w:color w:val="0B3060"/>
+          <w:sz w:val="19"/>
+        </w:rPr>
+        <w:t xml:space="preserve">  setError(null)</w:t>
+      </w:r>
+    </w:p>
+    <w:p>
+      <w:r>
+        <w:rPr>
+          <w:rFonts w:ascii="Consolas" w:hAnsi="Consolas"/>
+          <w:color w:val="0B3060"/>
+          <w:sz w:val="19"/>
+        </w:rPr>
+        <w:t>} else {</w:t>
+      </w:r>
+    </w:p>
+    <w:p>
+      <w:r>
+        <w:rPr>
+          <w:rFonts w:ascii="Consolas" w:hAnsi="Consolas"/>
+          <w:color w:val="0B3060"/>
+          <w:sz w:val="19"/>
+        </w:rPr>
+        <w:t xml:space="preserve">  setError(err.message)   // -&gt; the red 'Something went wrong'</w:t>
       </w:r>
     </w:p>
     <w:p>
@@ -20337,56 +18426,7 @@
         <w:pStyle w:val="ListNumber"/>
       </w:pPr>
       <w:r>
-        <w:t>Build AuthContext on top of it: store the token, send it on every request, verify it on boot with /api/auth/me</w:t>
-      </w:r>
-    </w:p>
-    <w:p>
-      <w:r>
-        <w:rPr>
-          <w:rFonts w:ascii="Consolas" w:hAnsi="Consolas"/>
-          <w:color w:val="0B3060"/>
-          <w:sz w:val="19"/>
-        </w:rPr>
-        <w:t>// src/lib/api.js</w:t>
-      </w:r>
-    </w:p>
-    <w:p>
-      <w:r>
-        <w:rPr>
-          <w:rFonts w:ascii="Consolas" w:hAnsi="Consolas"/>
-          <w:color w:val="0B3060"/>
-          <w:sz w:val="19"/>
-        </w:rPr>
-        <w:t>...(token ? { Authorization: `Bearer ${token}` } : {}),</w:t>
-      </w:r>
-    </w:p>
-    <w:p>
-      <w:r>
-        <w:rPr>
-          <w:rFonts w:ascii="Consolas" w:hAnsi="Consolas"/>
-          <w:color w:val="0B3060"/>
-          <w:sz w:val="19"/>
-        </w:rPr>
-      </w:r>
-    </w:p>
-    <w:p>
-      <w:r>
-        <w:rPr>
-          <w:rFonts w:ascii="Consolas" w:hAnsi="Consolas"/>
-          <w:color w:val="0B3060"/>
-          <w:sz w:val="19"/>
-        </w:rPr>
-        <w:t>// src/context/AuthContext.jsx — on boot, ask the SERVER who we are</w:t>
-      </w:r>
-    </w:p>
-    <w:p>
-      <w:r>
-        <w:rPr>
-          <w:rFonts w:ascii="Consolas" w:hAnsi="Consolas"/>
-          <w:color w:val="0B3060"/>
-          <w:sz w:val="19"/>
-        </w:rPr>
-        <w:t>const { user } = await api.get('/auth/me')   // 401 -&gt; clearToken()</w:t>
+        <w:t>Delete the import of src/data/courses.js from the pages. The catalogue is now Postgres</w:t>
       </w:r>
     </w:p>
     <w:p>
@@ -20394,27 +18434,45 @@
         <w:pStyle w:val="ListNumber"/>
       </w:pPr>
       <w:r>
-        <w:t>Tamper with the token in devtools (change one character) and refresh. The signature no longer matches</w:t>
-      </w:r>
-    </w:p>
-    <w:p>
-      <w:r>
-        <w:rPr>
-          <w:rFonts w:ascii="Consolas" w:hAnsi="Consolas"/>
-          <w:color w:val="0B3060"/>
-          <w:sz w:val="19"/>
-        </w:rPr>
-        <w:t># localStorage['cookbake.token'] -&gt; edit a char -&gt; refresh -&gt; 401 -&gt; signed out.</w:t>
-      </w:r>
-    </w:p>
-    <w:p>
-      <w:r>
-        <w:rPr>
-          <w:rFonts w:ascii="Consolas" w:hAnsi="Consolas"/>
-          <w:color w:val="0B3060"/>
-          <w:sz w:val="19"/>
-        </w:rPr>
-        <w:t># The browser cannot lie about who it is.</w:t>
+        <w:t>Prove it end to end: change a fee in the Neon table editor and refresh the browser</w:t>
+      </w:r>
+    </w:p>
+    <w:p>
+      <w:r>
+        <w:rPr>
+          <w:rFonts w:ascii="Consolas" w:hAnsi="Consolas"/>
+          <w:color w:val="0B3060"/>
+          <w:sz w:val="19"/>
+        </w:rPr>
+        <w:t>update courses set fee = 720 where code = 'BAK-101';</w:t>
+      </w:r>
+    </w:p>
+    <w:p>
+      <w:pPr>
+        <w:pStyle w:val="ListNumber"/>
+      </w:pPr>
+      <w:r>
+        <w:t>Test the error branch on purpose — throttle the network, then point BASE at a bad path</w:t>
+      </w:r>
+    </w:p>
+    <w:p>
+      <w:r>
+        <w:rPr>
+          <w:rFonts w:ascii="Consolas" w:hAnsi="Consolas"/>
+          <w:color w:val="0B3060"/>
+          <w:sz w:val="19"/>
+        </w:rPr>
+        <w:t>// DevTools -&gt; Network -&gt; Slow 3G  (see the skeletons)</w:t>
+      </w:r>
+    </w:p>
+    <w:p>
+      <w:r>
+        <w:rPr>
+          <w:rFonts w:ascii="Consolas" w:hAnsi="Consolas"/>
+          <w:color w:val="0B3060"/>
+          <w:sz w:val="19"/>
+        </w:rPr>
+        <w:t>// const BASE = '/apix'                (see the error line, not a blank page)</w:t>
       </w:r>
     </w:p>
     <w:p>
@@ -20429,7 +18487,7 @@
     </w:p>
     <w:p>
       <w:r>
-        <w:t>You can sign up, sign in, refresh and stay signed in; password_hash appears in NO API response; and editing the JWT in localStorage signs you straight out.</w:t>
+        <w:t>The catalogue renders from Postgres after a skeleton; editing a fee in Neon changes the page on refresh; /courses/not-a-course shows 'Course not found' (not a red error); and breaking the API base URL shows the error message instead of an endless skeleton.</w:t>
       </w:r>
     </w:p>
     <w:p>
@@ -20453,17 +18511,17 @@
         <w:pStyle w:val="Heading2"/>
       </w:pPr>
       <w:r>
-        <w:t>Lab 5.4 — Protected CRUD — Enrolments Scoped to the Signed-in User</w:t>
-      </w:r>
-    </w:p>
-    <w:p>
-      <w:r>
-        <w:t>Objective: let only the owner create, read and delete their own rows.</w:t>
-      </w:r>
-    </w:p>
-    <w:p>
-      <w:r>
-        <w:t>Goal: With accounts in place, students can finally enrol. The learner builds the enrolments API — where the security rule of the whole course lands: the user id comes from the VERIFIED TOKEN, never from the request body, and ownership is enforced in the WHERE clause, not in an if statement — then attacks the API by deleting another student's enrolment and watches it return 404.</w:t>
+        <w:t>Lab 5.4 — Auth — bcrypt, JWT, and Ownership Enforced in SQL</w:t>
+      </w:r>
+    </w:p>
+    <w:p>
+      <w:r>
+        <w:t>Objective: hash passwords, issue and verify JWTs, and let only the owner touch a row.</w:t>
+      </w:r>
+    </w:p>
+    <w:p>
+      <w:r>
+        <w:t>Goal: Students must be able to sign up, sign in, enrol and review. The learner builds api/auth/* with bcrypt hashing and JWT signing, then the enrolments API — where the security rule of the whole course lands: the user id comes from the VERIFIED TOKEN, never from the request body, and ownership is enforced in the WHERE clause, not in an if statement.</w:t>
       </w:r>
     </w:p>
     <w:p>
@@ -20478,7 +18536,7 @@
     </w:p>
     <w:p>
       <w:r>
-        <w:t>api/enrollments/index.js and api/enrollments/[id].js, the enrol button, the 'My learning' list and the route guard   (Tech &amp; files: Authorization: Bearer, insecure direct object references, ownership in SQL.)</w:t>
+        <w:t>api/auth/signup.js, login.js, me.js, api/_lib/auth.js, the enrollments + reviews routes, and src/context/AuthContext.jsx   (Tech &amp; files: bcryptjs, jsonwebtoken, JWT_SECRET, Authorization: Bearer, insecure direct object references.)</w:t>
       </w:r>
     </w:p>
     <w:p>
@@ -20496,6 +18554,324 @@
         <w:pStyle w:val="ListNumber"/>
       </w:pPr>
       <w:r>
+        <w:t>Add the second server-side secret — again, NO VITE_ prefix. Anyone holding it can mint a token for any user</w:t>
+      </w:r>
+    </w:p>
+    <w:p>
+      <w:r>
+        <w:rPr>
+          <w:rFonts w:ascii="Consolas" w:hAnsi="Consolas"/>
+          <w:color w:val="0B3060"/>
+          <w:sz w:val="19"/>
+        </w:rPr>
+        <w:t>JWT_SECRET=$(node -e "console.log(require('crypto').randomBytes(32).toString('hex'))")</w:t>
+      </w:r>
+    </w:p>
+    <w:p>
+      <w:r>
+        <w:rPr>
+          <w:rFonts w:ascii="Consolas" w:hAnsi="Consolas"/>
+          <w:color w:val="0B3060"/>
+          <w:sz w:val="19"/>
+        </w:rPr>
+        <w:t>npm install bcryptjs jsonwebtoken</w:t>
+      </w:r>
+    </w:p>
+    <w:p>
+      <w:pPr>
+        <w:pStyle w:val="ListNumber"/>
+      </w:pPr>
+      <w:r>
+        <w:t>NEVER store the password. bcrypt is a deliberately slow, salted, one-way hash</w:t>
+      </w:r>
+    </w:p>
+    <w:p>
+      <w:r>
+        <w:rPr>
+          <w:rFonts w:ascii="Consolas" w:hAnsi="Consolas"/>
+          <w:color w:val="0B3060"/>
+          <w:sz w:val="19"/>
+        </w:rPr>
+        <w:t>const passwordHash = await bcrypt.hash(password, 10)   // ~100ms by design: brute force is expensive</w:t>
+      </w:r>
+    </w:p>
+    <w:p>
+      <w:r>
+        <w:rPr>
+          <w:rFonts w:ascii="Consolas" w:hAnsi="Consolas"/>
+          <w:color w:val="0B3060"/>
+          <w:sz w:val="19"/>
+        </w:rPr>
+        <w:t>// bcrypt salts every hash, so two users with the same password get different hashes.</w:t>
+      </w:r>
+    </w:p>
+    <w:p>
+      <w:pPr>
+        <w:pStyle w:val="ListNumber"/>
+      </w:pPr>
+      <w:r>
+        <w:t>Insert the user and look hard at the RETURNING list — password_hash is NOT in it, and never will be</w:t>
+      </w:r>
+    </w:p>
+    <w:p>
+      <w:r>
+        <w:rPr>
+          <w:rFonts w:ascii="Consolas" w:hAnsi="Consolas"/>
+          <w:color w:val="0B3060"/>
+          <w:sz w:val="19"/>
+        </w:rPr>
+        <w:t>const rows = await sql`</w:t>
+      </w:r>
+    </w:p>
+    <w:p>
+      <w:r>
+        <w:rPr>
+          <w:rFonts w:ascii="Consolas" w:hAnsi="Consolas"/>
+          <w:color w:val="0B3060"/>
+          <w:sz w:val="19"/>
+        </w:rPr>
+        <w:t xml:space="preserve">  insert into users (email, name, password_hash)</w:t>
+      </w:r>
+    </w:p>
+    <w:p>
+      <w:r>
+        <w:rPr>
+          <w:rFonts w:ascii="Consolas" w:hAnsi="Consolas"/>
+          <w:color w:val="0B3060"/>
+          <w:sz w:val="19"/>
+        </w:rPr>
+        <w:t xml:space="preserve">  values (${email.trim().toLowerCase()}, ${name}, ${passwordHash})</w:t>
+      </w:r>
+    </w:p>
+    <w:p>
+      <w:r>
+        <w:rPr>
+          <w:rFonts w:ascii="Consolas" w:hAnsi="Consolas"/>
+          <w:color w:val="0B3060"/>
+          <w:sz w:val="19"/>
+        </w:rPr>
+        <w:t xml:space="preserve">  on conflict (email) do nothing</w:t>
+      </w:r>
+    </w:p>
+    <w:p>
+      <w:r>
+        <w:rPr>
+          <w:rFonts w:ascii="Consolas" w:hAnsi="Consolas"/>
+          <w:color w:val="0B3060"/>
+          <w:sz w:val="19"/>
+        </w:rPr>
+        <w:t xml:space="preserve">  returning id::int as id, email, name, created_at</w:t>
+      </w:r>
+    </w:p>
+    <w:p>
+      <w:r>
+        <w:rPr>
+          <w:rFonts w:ascii="Consolas" w:hAnsi="Consolas"/>
+          <w:color w:val="0B3060"/>
+          <w:sz w:val="19"/>
+        </w:rPr>
+        <w:t>`</w:t>
+      </w:r>
+    </w:p>
+    <w:p>
+      <w:r>
+        <w:rPr>
+          <w:rFonts w:ascii="Consolas" w:hAnsi="Consolas"/>
+          <w:color w:val="0B3060"/>
+          <w:sz w:val="19"/>
+        </w:rPr>
+        <w:t>// zero rows = the email is taken -&gt; 409. The hash never leaves this function.</w:t>
+      </w:r>
+    </w:p>
+    <w:p>
+      <w:pPr>
+        <w:pStyle w:val="ListNumber"/>
+      </w:pPr>
+      <w:r>
+        <w:t>Log in with bcrypt.compare — never re-hash and compare with ===, and give ONE message for both failures</w:t>
+      </w:r>
+    </w:p>
+    <w:p>
+      <w:r>
+        <w:rPr>
+          <w:rFonts w:ascii="Consolas" w:hAnsi="Consolas"/>
+          <w:color w:val="0B3060"/>
+          <w:sz w:val="19"/>
+        </w:rPr>
+        <w:t>const ok = user ? await bcrypt.compare(password, user.password_hash) : false</w:t>
+      </w:r>
+    </w:p>
+    <w:p>
+      <w:r>
+        <w:rPr>
+          <w:rFonts w:ascii="Consolas" w:hAnsi="Consolas"/>
+          <w:color w:val="0B3060"/>
+          <w:sz w:val="19"/>
+        </w:rPr>
+        <w:t>if (!ok) throw new HttpError(401, 'Invalid email or password.')</w:t>
+      </w:r>
+    </w:p>
+    <w:p>
+      <w:r>
+        <w:rPr>
+          <w:rFonts w:ascii="Consolas" w:hAnsi="Consolas"/>
+          <w:color w:val="0B3060"/>
+          <w:sz w:val="19"/>
+        </w:rPr>
+        <w:t>// Separate messages for 'no such email' and 'wrong password' hand an attacker a</w:t>
+      </w:r>
+    </w:p>
+    <w:p>
+      <w:r>
+        <w:rPr>
+          <w:rFonts w:ascii="Consolas" w:hAnsi="Consolas"/>
+          <w:color w:val="0B3060"/>
+          <w:sz w:val="19"/>
+        </w:rPr>
+        <w:t>// free tool for discovering which emails have accounts.</w:t>
+      </w:r>
+    </w:p>
+    <w:p>
+      <w:pPr>
+        <w:pStyle w:val="ListNumber"/>
+      </w:pPr>
+      <w:r>
+        <w:t>Sign a JWT. The payload is base64, NOT encrypted — anyone can read it, so put no secret in it</w:t>
+      </w:r>
+    </w:p>
+    <w:p>
+      <w:r>
+        <w:rPr>
+          <w:rFonts w:ascii="Consolas" w:hAnsi="Consolas"/>
+          <w:color w:val="0B3060"/>
+          <w:sz w:val="19"/>
+        </w:rPr>
+        <w:t>export function signToken(user) {</w:t>
+      </w:r>
+    </w:p>
+    <w:p>
+      <w:r>
+        <w:rPr>
+          <w:rFonts w:ascii="Consolas" w:hAnsi="Consolas"/>
+          <w:color w:val="0B3060"/>
+          <w:sz w:val="19"/>
+        </w:rPr>
+        <w:t xml:space="preserve">  return jwt.sign({ sub: String(user.id), email: user.email, name: user.name },</w:t>
+      </w:r>
+    </w:p>
+    <w:p>
+      <w:r>
+        <w:rPr>
+          <w:rFonts w:ascii="Consolas" w:hAnsi="Consolas"/>
+          <w:color w:val="0B3060"/>
+          <w:sz w:val="19"/>
+        </w:rPr>
+        <w:t xml:space="preserve">                  JWT_SECRET, { expiresIn: '7d' })</w:t>
+      </w:r>
+    </w:p>
+    <w:p>
+      <w:r>
+        <w:rPr>
+          <w:rFonts w:ascii="Consolas" w:hAnsi="Consolas"/>
+          <w:color w:val="0B3060"/>
+          <w:sz w:val="19"/>
+        </w:rPr>
+        <w:t>}</w:t>
+      </w:r>
+    </w:p>
+    <w:p>
+      <w:r>
+        <w:rPr>
+          <w:rFonts w:ascii="Consolas" w:hAnsi="Consolas"/>
+          <w:color w:val="0B3060"/>
+          <w:sz w:val="19"/>
+        </w:rPr>
+        <w:t>// What makes it trustworthy is the SIGNATURE. Edit one byte of the payload and</w:t>
+      </w:r>
+    </w:p>
+    <w:p>
+      <w:r>
+        <w:rPr>
+          <w:rFonts w:ascii="Consolas" w:hAnsi="Consolas"/>
+          <w:color w:val="0B3060"/>
+          <w:sz w:val="19"/>
+        </w:rPr>
+        <w:t>// verify() throws — which is why we may trust `sub` and must not trust req.body.</w:t>
+      </w:r>
+    </w:p>
+    <w:p>
+      <w:pPr>
+        <w:pStyle w:val="ListNumber"/>
+      </w:pPr>
+      <w:r>
+        <w:t>Write requireAuth — the single source of identity for the whole API</w:t>
+      </w:r>
+    </w:p>
+    <w:p>
+      <w:r>
+        <w:rPr>
+          <w:rFonts w:ascii="Consolas" w:hAnsi="Consolas"/>
+          <w:color w:val="0B3060"/>
+          <w:sz w:val="19"/>
+        </w:rPr>
+        <w:t>export function requireAuth(req) {</w:t>
+      </w:r>
+    </w:p>
+    <w:p>
+      <w:r>
+        <w:rPr>
+          <w:rFonts w:ascii="Consolas" w:hAnsi="Consolas"/>
+          <w:color w:val="0B3060"/>
+          <w:sz w:val="19"/>
+        </w:rPr>
+        <w:t xml:space="preserve">  const header = req.headers?.authorization ?? ''</w:t>
+      </w:r>
+    </w:p>
+    <w:p>
+      <w:r>
+        <w:rPr>
+          <w:rFonts w:ascii="Consolas" w:hAnsi="Consolas"/>
+          <w:color w:val="0B3060"/>
+          <w:sz w:val="19"/>
+        </w:rPr>
+        <w:t xml:space="preserve">  if (!header.startsWith('Bearer ')) throw new HttpError(401, 'Missing Authorization header.')</w:t>
+      </w:r>
+    </w:p>
+    <w:p>
+      <w:r>
+        <w:rPr>
+          <w:rFonts w:ascii="Consolas" w:hAnsi="Consolas"/>
+          <w:color w:val="0B3060"/>
+          <w:sz w:val="19"/>
+        </w:rPr>
+        <w:t xml:space="preserve">  const payload = jwt.verify(header.slice(7).trim(), JWT_SECRET)   // throws if tampered or expired</w:t>
+      </w:r>
+    </w:p>
+    <w:p>
+      <w:r>
+        <w:rPr>
+          <w:rFonts w:ascii="Consolas" w:hAnsi="Consolas"/>
+          <w:color w:val="0B3060"/>
+          <w:sz w:val="19"/>
+        </w:rPr>
+        <w:t xml:space="preserve">  return Number(payload.sub)   // the user's id — VERIFIED, not claimed</w:t>
+      </w:r>
+    </w:p>
+    <w:p>
+      <w:r>
+        <w:rPr>
+          <w:rFonts w:ascii="Consolas" w:hAnsi="Consolas"/>
+          <w:color w:val="0B3060"/>
+          <w:sz w:val="19"/>
+        </w:rPr>
+        <w:t>}</w:t>
+      </w:r>
+    </w:p>
+    <w:p>
+      <w:pPr>
+        <w:pStyle w:val="ListNumber"/>
+      </w:pPr>
+      <w:r>
         <w:t>THE RULE. In POST /api/enrollments the caller chooses the COURSE. The caller does NOT choose the USER</w:t>
       </w:r>
     </w:p>
@@ -20699,17 +19075,56 @@
         <w:pStyle w:val="ListNumber"/>
       </w:pPr>
       <w:r>
-        <w:t>Wire the front end: the enrol button posts to /api/enrollments and 'My learning' lists only your rows</w:t>
-      </w:r>
-    </w:p>
-    <w:p>
-      <w:r>
-        <w:rPr>
-          <w:rFonts w:ascii="Consolas" w:hAnsi="Consolas"/>
-          <w:color w:val="0B3060"/>
-          <w:sz w:val="19"/>
-        </w:rPr>
-        <w:t>await api.post('/enrollments', { courseId: course.id })</w:t>
+        <w:t>Build AuthContext on top of it: store the token, send it on every request, verify it on boot with /api/auth/me</w:t>
+      </w:r>
+    </w:p>
+    <w:p>
+      <w:r>
+        <w:rPr>
+          <w:rFonts w:ascii="Consolas" w:hAnsi="Consolas"/>
+          <w:color w:val="0B3060"/>
+          <w:sz w:val="19"/>
+        </w:rPr>
+        <w:t>// src/lib/api.js</w:t>
+      </w:r>
+    </w:p>
+    <w:p>
+      <w:r>
+        <w:rPr>
+          <w:rFonts w:ascii="Consolas" w:hAnsi="Consolas"/>
+          <w:color w:val="0B3060"/>
+          <w:sz w:val="19"/>
+        </w:rPr>
+        <w:t>...(token ? { Authorization: `Bearer ${token}` } : {}),</w:t>
+      </w:r>
+    </w:p>
+    <w:p>
+      <w:r>
+        <w:rPr>
+          <w:rFonts w:ascii="Consolas" w:hAnsi="Consolas"/>
+          <w:color w:val="0B3060"/>
+          <w:sz w:val="19"/>
+        </w:rPr>
+      </w:r>
+    </w:p>
+    <w:p>
+      <w:r>
+        <w:rPr>
+          <w:rFonts w:ascii="Consolas" w:hAnsi="Consolas"/>
+          <w:color w:val="0B3060"/>
+          <w:sz w:val="19"/>
+        </w:rPr>
+        <w:t>// src/context/AuthContext.jsx — on boot, ask the SERVER who we are</w:t>
+      </w:r>
+    </w:p>
+    <w:p>
+      <w:r>
+        <w:rPr>
+          <w:rFonts w:ascii="Consolas" w:hAnsi="Consolas"/>
+          <w:color w:val="0B3060"/>
+          <w:sz w:val="19"/>
+        </w:rPr>
+        <w:t>const { user } = await api.get('/auth/me')   // 401 -&gt; clearToken()</w:t>
       </w:r>
     </w:p>
     <w:p>
@@ -20748,6 +19163,34 @@
           <w:sz w:val="19"/>
         </w:rPr>
         <w:t># -&gt; 404 Enrollment not found.  The row exists — it is just not yours.</w:t>
+      </w:r>
+    </w:p>
+    <w:p>
+      <w:pPr>
+        <w:pStyle w:val="ListNumber"/>
+      </w:pPr>
+      <w:r>
+        <w:t>Tamper with the token in devtools (change one character) and refresh. The signature no longer matches</w:t>
+      </w:r>
+    </w:p>
+    <w:p>
+      <w:r>
+        <w:rPr>
+          <w:rFonts w:ascii="Consolas" w:hAnsi="Consolas"/>
+          <w:color w:val="0B3060"/>
+          <w:sz w:val="19"/>
+        </w:rPr>
+        <w:t># localStorage['cookbake.token'] -&gt; edit a char -&gt; refresh -&gt; 401 -&gt; signed out.</w:t>
+      </w:r>
+    </w:p>
+    <w:p>
+      <w:r>
+        <w:rPr>
+          <w:rFonts w:ascii="Consolas" w:hAnsi="Consolas"/>
+          <w:color w:val="0B3060"/>
+          <w:sz w:val="19"/>
+        </w:rPr>
+        <w:t># The browser cannot lie about who it is.</w:t>
       </w:r>
     </w:p>
     <w:p>
@@ -20762,7 +19205,7 @@
     </w:p>
     <w:p>
       <w:r>
-        <w:t>Enrolling writes a row you can see in Neon; 'My learning' shows only your enrolments; and deleting another student's enrolment by id returns 404 — the row exists, it is just not yours.</w:t>
+        <w:t>You can sign up, sign in, refresh and stay signed in; enrolling writes a row you can see in Neon; password_hash appears in NO API response; deleting another student's enrolment by id returns 404; and editing the JWT in localStorage signs you straight out.</w:t>
       </w:r>
     </w:p>
     <w:p>
@@ -24056,7 +22499,7 @@
     </w:p>
     <w:p>
       <w:r>
-        <w:t>Goal: The app is built and live. Now you add one brand-new END-TO-END feature — star-rated course reviews — mostly on your own. You write the prompts, read the generated code against everything this course taught you, correct it, and redeploy. This is the payoff of the whole course: a new API route with parameterised SQL, ownership from the JWT, a custom hook, a controlled form, a derived average, and a git push that puts it in production.</w:t>
+        <w:t>Goal: The app is built and live. Now you add one brand-new END-TO-END feature — star-rated course reviews — mostly on your own. You write the prompts, read the generated code against everything this course taught you, correct it, and redeploy. This is the exam of the whole course: a new API route with parameterised SQL, ownership from the JWT, a custom hook, a controlled form, a derived average, and a git push that puts it in production.</w:t>
       </w:r>
     </w:p>
     <w:p>
@@ -25854,6 +24297,7 @@
     </w:p>
     <w:sectPr>
       <w:footerReference w:type="default" r:id="rId10"/>
+      <w:headerReference w:type="default" r:id="rId11"/>
       <w:pgSz w:w="12240" w:h="15840"/>
       <w:pgMar w:top="1440" w:right="1800" w:bottom="1440" w:left="1800" w:header="720" w:footer="720" w:gutter="0"/>
       <w:cols w:space="720"/>
@@ -25919,6 +24363,16 @@
     </w:r>
   </w:p>
 </w:ftr>
+</file>
+
+<file path=word/header1.xml><?xml version="1.0" encoding="utf-8"?>
+<w:hdr xmlns:m="http://schemas.openxmlformats.org/officeDocument/2006/math" xmlns:mc="http://schemas.openxmlformats.org/markup-compatibility/2006" xmlns:mo="http://schemas.microsoft.com/office/mac/office/2008/main" xmlns:mv="urn:schemas-microsoft-com:mac:vml" xmlns:o="urn:schemas-microsoft-com:office:office" xmlns:r="http://schemas.openxmlformats.org/officeDocument/2006/relationships" xmlns:v="urn:schemas-microsoft-com:vml" xmlns:w10="urn:schemas-microsoft-com:office:word" xmlns:w14="http://schemas.microsoft.com/office/word/2010/wordml" xmlns:w="http://schemas.openxmlformats.org/wordprocessingml/2006/main" xmlns:wne="http://schemas.microsoft.com/office/word/2006/wordml" xmlns:wp14="http://schemas.microsoft.com/office/word/2010/wordprocessingDrawing" xmlns:wp="http://schemas.openxmlformats.org/drawingml/2006/wordprocessingDrawing" xmlns:wpc="http://schemas.microsoft.com/office/word/2010/wordprocessingCanvas" xmlns:wpg="http://schemas.microsoft.com/office/word/2010/wordprocessingGroup" xmlns:wpi="http://schemas.microsoft.com/office/word/2010/wordprocessingInk" xmlns:wps="http://schemas.microsoft.com/office/word/2010/wordprocessingShape" mc:Ignorable="w14 wp14">
+  <w:p>
+    <w:pPr>
+      <w:pStyle w:val="Header"/>
+    </w:pPr>
+  </w:p>
+</w:hdr>
 </file>
 
 <file path=word/numbering.xml><?xml version="1.0" encoding="utf-8"?>

</xml_diff>